<commit_message>
Cập nhật slide và tài liệu Use Case cho khớp với app: Kotlin/Compose/SQLite, Use Case mới, đặc tả đúng luồng, sửa thông tin khảo sát
</commit_message>
<xml_diff>
--- a/docs/UseCase_SubTrack.docx
+++ b/docs/UseCase_SubTrack.docx
@@ -194,7 +194,7 @@
                 <w:sz w:val="22"/>
                 <w:szCs w:val="22"/>
               </w:rPr>
-              <w:t xml:space="preserve">Người quản lý các gói đăng ký của mình: thêm, sửa, xóa, tìm kiếm, xem thống kê và nhắc hạn.</w:t>
+              <w:t xml:space="preserve">Người quản lý các gói đăng ký của mình trên điện thoại: thêm, sửa, xóa, tìm kiếm, xem báo cáo, đặt nhắc hạn, xuất dữ liệu.</w:t>
             </w:r>
           </w:p>
         </w:tc>
@@ -218,7 +218,7 @@
                 <w:sz w:val="22"/>
                 <w:szCs w:val="22"/>
               </w:rPr>
-              <w:t xml:space="preserve">Firebase Auth</w:t>
+              <w:t xml:space="preserve">Hệ thống thông báo</w:t>
             </w:r>
           </w:p>
         </w:tc>
@@ -262,7 +262,7 @@
                 <w:sz w:val="22"/>
                 <w:szCs w:val="22"/>
               </w:rPr>
-              <w:t xml:space="preserve">Dịch vụ xác thực tài khoản (chỉ dùng khi triển khai chức năng đăng ký/đăng nhập).</w:t>
+              <w:t xml:space="preserve">WorkManager và dịch vụ thông báo của Android: chạy kiểm tra hằng ngày và hiển thị thông báo nhắc hạn.</w:t>
             </w:r>
           </w:p>
         </w:tc>
@@ -286,7 +286,7 @@
                 <w:sz w:val="22"/>
                 <w:szCs w:val="22"/>
               </w:rPr>
-              <w:t xml:space="preserve">Hệ thống thông báo</w:t>
+              <w:t xml:space="preserve">Ứng dụng Lịch</w:t>
             </w:r>
           </w:p>
         </w:tc>
@@ -330,7 +330,7 @@
                 <w:sz w:val="22"/>
                 <w:szCs w:val="22"/>
               </w:rPr>
-              <w:t xml:space="preserve">Dịch vụ thông báo cục bộ của Android/iOS, hiển thị nhắc hạn thanh toán cho người dùng.</w:t>
+              <w:t xml:space="preserve">Ứng dụng Lịch có sẵn trên điện thoại, nhận sự kiện thanh toán lặp lại do SubTrack gửi sang.</w:t>
             </w:r>
           </w:p>
         </w:tc>
@@ -414,7 +414,7 @@
           <w:sz w:val="22"/>
           <w:szCs w:val="22"/>
         </w:rPr>
-        <w:t xml:space="preserve">Ghi chú: Use Case viền liền là chức năng chính (MVP); viền nét đứt là chức năng mở rộng làm nếu còn thời gian. «include» là chức năng luôn được gọi kèm; «extend» là chức năng bổ sung tùy chọn.</w:t>
+        <w:t xml:space="preserve">Ghi chú: Use Case viền liền là chức năng đã triển khai trong ứng dụng; viền nét đứt là hướng phát triển chưa làm. «include» là chức năng luôn được gọi kèm; «extend» là chức năng bổ sung tùy chọn. Ứng dụng lưu dữ liệu trên máy (SQLite), không cần tài khoản.</w:t>
       </w:r>
     </w:p>
     <w:p>
@@ -440,9 +440,9 @@
       </w:tblPr>
       <w:tblGrid>
         <w:gridCol w:w="867"/>
-        <w:gridCol w:w="2313"/>
-        <w:gridCol w:w="1928"/>
-        <w:gridCol w:w="1060"/>
+        <w:gridCol w:w="2217"/>
+        <w:gridCol w:w="1831"/>
+        <w:gridCol w:w="1253"/>
         <w:gridCol w:w="3470"/>
       </w:tblGrid>
       <w:tr>
@@ -474,7 +474,7 @@
         </w:tc>
         <w:tc>
           <w:tcPr>
-            <w:tcW w:type="pct" w:w="1200"/>
+            <w:tcW w:type="pct" w:w="1150"/>
             <w:shd w:fill="E6E1F7" w:color="auto" w:val="clear"/>
             <w:tcMar>
               <w:top w:type="dxa" w:w="60"/>
@@ -497,7 +497,7 @@
         </w:tc>
         <w:tc>
           <w:tcPr>
-            <w:tcW w:type="pct" w:w="1000"/>
+            <w:tcW w:type="pct" w:w="950"/>
             <w:shd w:fill="E6E1F7" w:color="auto" w:val="clear"/>
             <w:tcMar>
               <w:top w:type="dxa" w:w="60"/>
@@ -520,7 +520,7 @@
         </w:tc>
         <w:tc>
           <w:tcPr>
-            <w:tcW w:type="pct" w:w="550"/>
+            <w:tcW w:type="pct" w:w="650"/>
             <w:shd w:fill="E6E1F7" w:color="auto" w:val="clear"/>
             <w:tcMar>
               <w:top w:type="dxa" w:w="60"/>
@@ -537,7 +537,7 @@
                 <w:sz w:val="22"/>
                 <w:szCs w:val="22"/>
               </w:rPr>
-              <w:t xml:space="preserve">Loại</w:t>
+              <w:t xml:space="preserve">Trạng thái</w:t>
             </w:r>
           </w:p>
         </w:tc>
@@ -590,67 +590,67 @@
         </w:tc>
         <w:tc>
           <w:tcPr>
-            <w:tcW w:type="pct" w:w="1200"/>
-            <w:tcMar>
-              <w:top w:type="dxa" w:w="60"/>
-              <w:left w:type="dxa" w:w="100"/>
-              <w:bottom w:type="dxa" w:w="60"/>
-              <w:right w:type="dxa" w:w="100"/>
-            </w:tcMar>
-          </w:tcPr>
-          <w:p>
-            <w:r>
-              <w:rPr>
-                <w:b w:val="false"/>
-                <w:bCs w:val="false"/>
-                <w:sz w:val="22"/>
-                <w:szCs w:val="22"/>
-              </w:rPr>
-              <w:t xml:space="preserve">Đăng ký / Đăng nhập</w:t>
-            </w:r>
-          </w:p>
-        </w:tc>
-        <w:tc>
-          <w:tcPr>
-            <w:tcW w:type="pct" w:w="1000"/>
-            <w:tcMar>
-              <w:top w:type="dxa" w:w="60"/>
-              <w:left w:type="dxa" w:w="100"/>
-              <w:bottom w:type="dxa" w:w="60"/>
-              <w:right w:type="dxa" w:w="100"/>
-            </w:tcMar>
-          </w:tcPr>
-          <w:p>
-            <w:r>
-              <w:rPr>
-                <w:b w:val="false"/>
-                <w:bCs w:val="false"/>
-                <w:sz w:val="22"/>
-                <w:szCs w:val="22"/>
-              </w:rPr>
-              <w:t xml:space="preserve">Người dùng, Firebase Auth</w:t>
-            </w:r>
-          </w:p>
-        </w:tc>
-        <w:tc>
-          <w:tcPr>
-            <w:tcW w:type="pct" w:w="550"/>
-            <w:tcMar>
-              <w:top w:type="dxa" w:w="60"/>
-              <w:left w:type="dxa" w:w="100"/>
-              <w:bottom w:type="dxa" w:w="60"/>
-              <w:right w:type="dxa" w:w="100"/>
-            </w:tcMar>
-          </w:tcPr>
-          <w:p>
-            <w:r>
-              <w:rPr>
-                <w:b w:val="false"/>
-                <w:bCs w:val="false"/>
-                <w:sz w:val="22"/>
-                <w:szCs w:val="22"/>
-              </w:rPr>
-              <w:t xml:space="preserve">Mở rộng</w:t>
+            <w:tcW w:type="pct" w:w="1150"/>
+            <w:tcMar>
+              <w:top w:type="dxa" w:w="60"/>
+              <w:left w:type="dxa" w:w="100"/>
+              <w:bottom w:type="dxa" w:w="60"/>
+              <w:right w:type="dxa" w:w="100"/>
+            </w:tcMar>
+          </w:tcPr>
+          <w:p>
+            <w:r>
+              <w:rPr>
+                <w:b w:val="false"/>
+                <w:bCs w:val="false"/>
+                <w:sz w:val="22"/>
+                <w:szCs w:val="22"/>
+              </w:rPr>
+              <w:t xml:space="preserve">Xem tổng quan chi phí</w:t>
+            </w:r>
+          </w:p>
+        </w:tc>
+        <w:tc>
+          <w:tcPr>
+            <w:tcW w:type="pct" w:w="950"/>
+            <w:tcMar>
+              <w:top w:type="dxa" w:w="60"/>
+              <w:left w:type="dxa" w:w="100"/>
+              <w:bottom w:type="dxa" w:w="60"/>
+              <w:right w:type="dxa" w:w="100"/>
+            </w:tcMar>
+          </w:tcPr>
+          <w:p>
+            <w:r>
+              <w:rPr>
+                <w:b w:val="false"/>
+                <w:bCs w:val="false"/>
+                <w:sz w:val="22"/>
+                <w:szCs w:val="22"/>
+              </w:rPr>
+              <w:t xml:space="preserve">Người dùng</w:t>
+            </w:r>
+          </w:p>
+        </w:tc>
+        <w:tc>
+          <w:tcPr>
+            <w:tcW w:type="pct" w:w="650"/>
+            <w:tcMar>
+              <w:top w:type="dxa" w:w="60"/>
+              <w:left w:type="dxa" w:w="100"/>
+              <w:bottom w:type="dxa" w:w="60"/>
+              <w:right w:type="dxa" w:w="100"/>
+            </w:tcMar>
+          </w:tcPr>
+          <w:p>
+            <w:r>
+              <w:rPr>
+                <w:b w:val="false"/>
+                <w:bCs w:val="false"/>
+                <w:sz w:val="22"/>
+                <w:szCs w:val="22"/>
+              </w:rPr>
+              <w:t xml:space="preserve">Đã làm</w:t>
             </w:r>
           </w:p>
         </w:tc>
@@ -672,7 +672,7 @@
                 <w:sz w:val="22"/>
                 <w:szCs w:val="22"/>
               </w:rPr>
-              <w:t xml:space="preserve">Tạo tài khoản, đăng nhập để mỗi người chỉ thấy dữ liệu của mình.</w:t>
+              <w:t xml:space="preserve">Thẻ đầu màn hình Gói đăng ký: chi phí tháng ước tính, số gói đang hoạt động, số gói đến hạn trong 7 ngày.</w:t>
             </w:r>
           </w:p>
         </w:tc>
@@ -702,29 +702,29 @@
         </w:tc>
         <w:tc>
           <w:tcPr>
-            <w:tcW w:type="pct" w:w="1200"/>
-            <w:tcMar>
-              <w:top w:type="dxa" w:w="60"/>
-              <w:left w:type="dxa" w:w="100"/>
-              <w:bottom w:type="dxa" w:w="60"/>
-              <w:right w:type="dxa" w:w="100"/>
-            </w:tcMar>
-          </w:tcPr>
-          <w:p>
-            <w:r>
-              <w:rPr>
-                <w:b w:val="false"/>
-                <w:bCs w:val="false"/>
-                <w:sz w:val="22"/>
-                <w:szCs w:val="22"/>
-              </w:rPr>
-              <w:t xml:space="preserve">Xem Dashboard tổng quan</w:t>
-            </w:r>
-          </w:p>
-        </w:tc>
-        <w:tc>
-          <w:tcPr>
-            <w:tcW w:type="pct" w:w="1000"/>
+            <w:tcW w:type="pct" w:w="1150"/>
+            <w:tcMar>
+              <w:top w:type="dxa" w:w="60"/>
+              <w:left w:type="dxa" w:w="100"/>
+              <w:bottom w:type="dxa" w:w="60"/>
+              <w:right w:type="dxa" w:w="100"/>
+            </w:tcMar>
+          </w:tcPr>
+          <w:p>
+            <w:r>
+              <w:rPr>
+                <w:b w:val="false"/>
+                <w:bCs w:val="false"/>
+                <w:sz w:val="22"/>
+                <w:szCs w:val="22"/>
+              </w:rPr>
+              <w:t xml:space="preserve">Thêm gói đăng ký</w:t>
+            </w:r>
+          </w:p>
+        </w:tc>
+        <w:tc>
+          <w:tcPr>
+            <w:tcW w:type="pct" w:w="950"/>
             <w:tcMar>
               <w:top w:type="dxa" w:w="60"/>
               <w:left w:type="dxa" w:w="100"/>
@@ -746,23 +746,23 @@
         </w:tc>
         <w:tc>
           <w:tcPr>
-            <w:tcW w:type="pct" w:w="550"/>
-            <w:tcMar>
-              <w:top w:type="dxa" w:w="60"/>
-              <w:left w:type="dxa" w:w="100"/>
-              <w:bottom w:type="dxa" w:w="60"/>
-              <w:right w:type="dxa" w:w="100"/>
-            </w:tcMar>
-          </w:tcPr>
-          <w:p>
-            <w:r>
-              <w:rPr>
-                <w:b w:val="false"/>
-                <w:bCs w:val="false"/>
-                <w:sz w:val="22"/>
-                <w:szCs w:val="22"/>
-              </w:rPr>
-              <w:t xml:space="preserve">Chính</w:t>
+            <w:tcW w:type="pct" w:w="650"/>
+            <w:tcMar>
+              <w:top w:type="dxa" w:w="60"/>
+              <w:left w:type="dxa" w:w="100"/>
+              <w:bottom w:type="dxa" w:w="60"/>
+              <w:right w:type="dxa" w:w="100"/>
+            </w:tcMar>
+          </w:tcPr>
+          <w:p>
+            <w:r>
+              <w:rPr>
+                <w:b w:val="false"/>
+                <w:bCs w:val="false"/>
+                <w:sz w:val="22"/>
+                <w:szCs w:val="22"/>
+              </w:rPr>
+              <w:t xml:space="preserve">Đã làm</w:t>
             </w:r>
           </w:p>
         </w:tc>
@@ -784,7 +784,7 @@
                 <w:sz w:val="22"/>
                 <w:szCs w:val="22"/>
               </w:rPr>
-              <w:t xml:space="preserve">Xem tổng số gói, chi phí tháng ước tính, khoản sắp đến hạn, gói gần nhất.</w:t>
+              <w:t xml:space="preserve">Nhập thông tin gói mới và lưu vào SQLite.</w:t>
             </w:r>
           </w:p>
         </w:tc>
@@ -814,29 +814,29 @@
         </w:tc>
         <w:tc>
           <w:tcPr>
-            <w:tcW w:type="pct" w:w="1200"/>
-            <w:tcMar>
-              <w:top w:type="dxa" w:w="60"/>
-              <w:left w:type="dxa" w:w="100"/>
-              <w:bottom w:type="dxa" w:w="60"/>
-              <w:right w:type="dxa" w:w="100"/>
-            </w:tcMar>
-          </w:tcPr>
-          <w:p>
-            <w:r>
-              <w:rPr>
-                <w:b w:val="false"/>
-                <w:bCs w:val="false"/>
-                <w:sz w:val="22"/>
-                <w:szCs w:val="22"/>
-              </w:rPr>
-              <w:t xml:space="preserve">Thêm gói đăng ký</w:t>
-            </w:r>
-          </w:p>
-        </w:tc>
-        <w:tc>
-          <w:tcPr>
-            <w:tcW w:type="pct" w:w="1000"/>
+            <w:tcW w:type="pct" w:w="1150"/>
+            <w:tcMar>
+              <w:top w:type="dxa" w:w="60"/>
+              <w:left w:type="dxa" w:w="100"/>
+              <w:bottom w:type="dxa" w:w="60"/>
+              <w:right w:type="dxa" w:w="100"/>
+            </w:tcMar>
+          </w:tcPr>
+          <w:p>
+            <w:r>
+              <w:rPr>
+                <w:b w:val="false"/>
+                <w:bCs w:val="false"/>
+                <w:sz w:val="22"/>
+                <w:szCs w:val="22"/>
+              </w:rPr>
+              <w:t xml:space="preserve">Xem và sửa gói đăng ký</w:t>
+            </w:r>
+          </w:p>
+        </w:tc>
+        <w:tc>
+          <w:tcPr>
+            <w:tcW w:type="pct" w:w="950"/>
             <w:tcMar>
               <w:top w:type="dxa" w:w="60"/>
               <w:left w:type="dxa" w:w="100"/>
@@ -858,23 +858,23 @@
         </w:tc>
         <w:tc>
           <w:tcPr>
-            <w:tcW w:type="pct" w:w="550"/>
-            <w:tcMar>
-              <w:top w:type="dxa" w:w="60"/>
-              <w:left w:type="dxa" w:w="100"/>
-              <w:bottom w:type="dxa" w:w="60"/>
-              <w:right w:type="dxa" w:w="100"/>
-            </w:tcMar>
-          </w:tcPr>
-          <w:p>
-            <w:r>
-              <w:rPr>
-                <w:b w:val="false"/>
-                <w:bCs w:val="false"/>
-                <w:sz w:val="22"/>
-                <w:szCs w:val="22"/>
-              </w:rPr>
-              <w:t xml:space="preserve">Chính</w:t>
+            <w:tcW w:type="pct" w:w="650"/>
+            <w:tcMar>
+              <w:top w:type="dxa" w:w="60"/>
+              <w:left w:type="dxa" w:w="100"/>
+              <w:bottom w:type="dxa" w:w="60"/>
+              <w:right w:type="dxa" w:w="100"/>
+            </w:tcMar>
+          </w:tcPr>
+          <w:p>
+            <w:r>
+              <w:rPr>
+                <w:b w:val="false"/>
+                <w:bCs w:val="false"/>
+                <w:sz w:val="22"/>
+                <w:szCs w:val="22"/>
+              </w:rPr>
+              <w:t xml:space="preserve">Đã làm</w:t>
             </w:r>
           </w:p>
         </w:tc>
@@ -896,7 +896,7 @@
                 <w:sz w:val="22"/>
                 <w:szCs w:val="22"/>
               </w:rPr>
-              <w:t xml:space="preserve">Nhập thông tin gói mới và lưu vào database.</w:t>
+              <w:t xml:space="preserve">Chạm vào một gói để mở form chứa toàn bộ thông tin, sửa rồi lưu.</w:t>
             </w:r>
           </w:p>
         </w:tc>
@@ -926,29 +926,29 @@
         </w:tc>
         <w:tc>
           <w:tcPr>
-            <w:tcW w:type="pct" w:w="1200"/>
-            <w:tcMar>
-              <w:top w:type="dxa" w:w="60"/>
-              <w:left w:type="dxa" w:w="100"/>
-              <w:bottom w:type="dxa" w:w="60"/>
-              <w:right w:type="dxa" w:w="100"/>
-            </w:tcMar>
-          </w:tcPr>
-          <w:p>
-            <w:r>
-              <w:rPr>
-                <w:b w:val="false"/>
-                <w:bCs w:val="false"/>
-                <w:sz w:val="22"/>
-                <w:szCs w:val="22"/>
-              </w:rPr>
-              <w:t xml:space="preserve">Xem chi tiết gói</w:t>
-            </w:r>
-          </w:p>
-        </w:tc>
-        <w:tc>
-          <w:tcPr>
-            <w:tcW w:type="pct" w:w="1000"/>
+            <w:tcW w:type="pct" w:w="1150"/>
+            <w:tcMar>
+              <w:top w:type="dxa" w:w="60"/>
+              <w:left w:type="dxa" w:w="100"/>
+              <w:bottom w:type="dxa" w:w="60"/>
+              <w:right w:type="dxa" w:w="100"/>
+            </w:tcMar>
+          </w:tcPr>
+          <w:p>
+            <w:r>
+              <w:rPr>
+                <w:b w:val="false"/>
+                <w:bCs w:val="false"/>
+                <w:sz w:val="22"/>
+                <w:szCs w:val="22"/>
+              </w:rPr>
+              <w:t xml:space="preserve">Xóa gói đăng ký</w:t>
+            </w:r>
+          </w:p>
+        </w:tc>
+        <w:tc>
+          <w:tcPr>
+            <w:tcW w:type="pct" w:w="950"/>
             <w:tcMar>
               <w:top w:type="dxa" w:w="60"/>
               <w:left w:type="dxa" w:w="100"/>
@@ -970,23 +970,23 @@
         </w:tc>
         <w:tc>
           <w:tcPr>
-            <w:tcW w:type="pct" w:w="550"/>
-            <w:tcMar>
-              <w:top w:type="dxa" w:w="60"/>
-              <w:left w:type="dxa" w:w="100"/>
-              <w:bottom w:type="dxa" w:w="60"/>
-              <w:right w:type="dxa" w:w="100"/>
-            </w:tcMar>
-          </w:tcPr>
-          <w:p>
-            <w:r>
-              <w:rPr>
-                <w:b w:val="false"/>
-                <w:bCs w:val="false"/>
-                <w:sz w:val="22"/>
-                <w:szCs w:val="22"/>
-              </w:rPr>
-              <w:t xml:space="preserve">Chính</w:t>
+            <w:tcW w:type="pct" w:w="650"/>
+            <w:tcMar>
+              <w:top w:type="dxa" w:w="60"/>
+              <w:left w:type="dxa" w:w="100"/>
+              <w:bottom w:type="dxa" w:w="60"/>
+              <w:right w:type="dxa" w:w="100"/>
+            </w:tcMar>
+          </w:tcPr>
+          <w:p>
+            <w:r>
+              <w:rPr>
+                <w:b w:val="false"/>
+                <w:bCs w:val="false"/>
+                <w:sz w:val="22"/>
+                <w:szCs w:val="22"/>
+              </w:rPr>
+              <w:t xml:space="preserve">Đã làm</w:t>
             </w:r>
           </w:p>
         </w:tc>
@@ -1008,7 +1008,7 @@
                 <w:sz w:val="22"/>
                 <w:szCs w:val="22"/>
               </w:rPr>
-              <w:t xml:space="preserve">Xem đầy đủ thông tin một gói đăng ký.</w:t>
+              <w:t xml:space="preserve">Xóa gói từ màn hình sửa sau khi xác nhận.</w:t>
             </w:r>
           </w:p>
         </w:tc>
@@ -1038,29 +1038,29 @@
         </w:tc>
         <w:tc>
           <w:tcPr>
-            <w:tcW w:type="pct" w:w="1200"/>
-            <w:tcMar>
-              <w:top w:type="dxa" w:w="60"/>
-              <w:left w:type="dxa" w:w="100"/>
-              <w:bottom w:type="dxa" w:w="60"/>
-              <w:right w:type="dxa" w:w="100"/>
-            </w:tcMar>
-          </w:tcPr>
-          <w:p>
-            <w:r>
-              <w:rPr>
-                <w:b w:val="false"/>
-                <w:bCs w:val="false"/>
-                <w:sz w:val="22"/>
-                <w:szCs w:val="22"/>
-              </w:rPr>
-              <w:t xml:space="preserve">Sửa gói đăng ký</w:t>
-            </w:r>
-          </w:p>
-        </w:tc>
-        <w:tc>
-          <w:tcPr>
-            <w:tcW w:type="pct" w:w="1000"/>
+            <w:tcW w:type="pct" w:w="1150"/>
+            <w:tcMar>
+              <w:top w:type="dxa" w:w="60"/>
+              <w:left w:type="dxa" w:w="100"/>
+              <w:bottom w:type="dxa" w:w="60"/>
+              <w:right w:type="dxa" w:w="100"/>
+            </w:tcMar>
+          </w:tcPr>
+          <w:p>
+            <w:r>
+              <w:rPr>
+                <w:b w:val="false"/>
+                <w:bCs w:val="false"/>
+                <w:sz w:val="22"/>
+                <w:szCs w:val="22"/>
+              </w:rPr>
+              <w:t xml:space="preserve">Tìm kiếm, lọc, sắp xếp</w:t>
+            </w:r>
+          </w:p>
+        </w:tc>
+        <w:tc>
+          <w:tcPr>
+            <w:tcW w:type="pct" w:w="950"/>
             <w:tcMar>
               <w:top w:type="dxa" w:w="60"/>
               <w:left w:type="dxa" w:w="100"/>
@@ -1082,23 +1082,23 @@
         </w:tc>
         <w:tc>
           <w:tcPr>
-            <w:tcW w:type="pct" w:w="550"/>
-            <w:tcMar>
-              <w:top w:type="dxa" w:w="60"/>
-              <w:left w:type="dxa" w:w="100"/>
-              <w:bottom w:type="dxa" w:w="60"/>
-              <w:right w:type="dxa" w:w="100"/>
-            </w:tcMar>
-          </w:tcPr>
-          <w:p>
-            <w:r>
-              <w:rPr>
-                <w:b w:val="false"/>
-                <w:bCs w:val="false"/>
-                <w:sz w:val="22"/>
-                <w:szCs w:val="22"/>
-              </w:rPr>
-              <w:t xml:space="preserve">Chính</w:t>
+            <w:tcW w:type="pct" w:w="650"/>
+            <w:tcMar>
+              <w:top w:type="dxa" w:w="60"/>
+              <w:left w:type="dxa" w:w="100"/>
+              <w:bottom w:type="dxa" w:w="60"/>
+              <w:right w:type="dxa" w:w="100"/>
+            </w:tcMar>
+          </w:tcPr>
+          <w:p>
+            <w:r>
+              <w:rPr>
+                <w:b w:val="false"/>
+                <w:bCs w:val="false"/>
+                <w:sz w:val="22"/>
+                <w:szCs w:val="22"/>
+              </w:rPr>
+              <w:t xml:space="preserve">Đã làm</w:t>
             </w:r>
           </w:p>
         </w:tc>
@@ -1120,7 +1120,7 @@
                 <w:sz w:val="22"/>
                 <w:szCs w:val="22"/>
               </w:rPr>
-              <w:t xml:space="preserve">Cập nhật thông tin của gói đã có.</w:t>
+              <w:t xml:space="preserve">Tìm theo tên, tag, nền tảng, danh mục; lọc trạng thái và danh mục; sắp theo ngày, chi phí, tên.</w:t>
             </w:r>
           </w:p>
         </w:tc>
@@ -1150,29 +1150,29 @@
         </w:tc>
         <w:tc>
           <w:tcPr>
-            <w:tcW w:type="pct" w:w="1200"/>
-            <w:tcMar>
-              <w:top w:type="dxa" w:w="60"/>
-              <w:left w:type="dxa" w:w="100"/>
-              <w:bottom w:type="dxa" w:w="60"/>
-              <w:right w:type="dxa" w:w="100"/>
-            </w:tcMar>
-          </w:tcPr>
-          <w:p>
-            <w:r>
-              <w:rPr>
-                <w:b w:val="false"/>
-                <w:bCs w:val="false"/>
-                <w:sz w:val="22"/>
-                <w:szCs w:val="22"/>
-              </w:rPr>
-              <w:t xml:space="preserve">Xóa gói đăng ký</w:t>
-            </w:r>
-          </w:p>
-        </w:tc>
-        <w:tc>
-          <w:tcPr>
-            <w:tcW w:type="pct" w:w="1000"/>
+            <w:tcW w:type="pct" w:w="1150"/>
+            <w:tcMar>
+              <w:top w:type="dxa" w:w="60"/>
+              <w:left w:type="dxa" w:w="100"/>
+              <w:bottom w:type="dxa" w:w="60"/>
+              <w:right w:type="dxa" w:w="100"/>
+            </w:tcMar>
+          </w:tcPr>
+          <w:p>
+            <w:r>
+              <w:rPr>
+                <w:b w:val="false"/>
+                <w:bCs w:val="false"/>
+                <w:sz w:val="22"/>
+                <w:szCs w:val="22"/>
+              </w:rPr>
+              <w:t xml:space="preserve">Xem báo cáo chi phí</w:t>
+            </w:r>
+          </w:p>
+        </w:tc>
+        <w:tc>
+          <w:tcPr>
+            <w:tcW w:type="pct" w:w="950"/>
             <w:tcMar>
               <w:top w:type="dxa" w:w="60"/>
               <w:left w:type="dxa" w:w="100"/>
@@ -1194,23 +1194,23 @@
         </w:tc>
         <w:tc>
           <w:tcPr>
-            <w:tcW w:type="pct" w:w="550"/>
-            <w:tcMar>
-              <w:top w:type="dxa" w:w="60"/>
-              <w:left w:type="dxa" w:w="100"/>
-              <w:bottom w:type="dxa" w:w="60"/>
-              <w:right w:type="dxa" w:w="100"/>
-            </w:tcMar>
-          </w:tcPr>
-          <w:p>
-            <w:r>
-              <w:rPr>
-                <w:b w:val="false"/>
-                <w:bCs w:val="false"/>
-                <w:sz w:val="22"/>
-                <w:szCs w:val="22"/>
-              </w:rPr>
-              <w:t xml:space="preserve">Chính</w:t>
+            <w:tcW w:type="pct" w:w="650"/>
+            <w:tcMar>
+              <w:top w:type="dxa" w:w="60"/>
+              <w:left w:type="dxa" w:w="100"/>
+              <w:bottom w:type="dxa" w:w="60"/>
+              <w:right w:type="dxa" w:w="100"/>
+            </w:tcMar>
+          </w:tcPr>
+          <w:p>
+            <w:r>
+              <w:rPr>
+                <w:b w:val="false"/>
+                <w:bCs w:val="false"/>
+                <w:sz w:val="22"/>
+                <w:szCs w:val="22"/>
+              </w:rPr>
+              <w:t xml:space="preserve">Đã làm</w:t>
             </w:r>
           </w:p>
         </w:tc>
@@ -1232,7 +1232,7 @@
                 <w:sz w:val="22"/>
                 <w:szCs w:val="22"/>
               </w:rPr>
-              <w:t xml:space="preserve">Xóa gói sau khi người dùng xác nhận.</w:t>
+              <w:t xml:space="preserve">Chi phí tuần/tháng/quý/năm, biểu đồ tròn theo gói, chi phí theo danh mục, 3 gói tốn kém nhất.</w:t>
             </w:r>
           </w:p>
         </w:tc>
@@ -1262,29 +1262,29 @@
         </w:tc>
         <w:tc>
           <w:tcPr>
-            <w:tcW w:type="pct" w:w="1200"/>
-            <w:tcMar>
-              <w:top w:type="dxa" w:w="60"/>
-              <w:left w:type="dxa" w:w="100"/>
-              <w:bottom w:type="dxa" w:w="60"/>
-              <w:right w:type="dxa" w:w="100"/>
-            </w:tcMar>
-          </w:tcPr>
-          <w:p>
-            <w:r>
-              <w:rPr>
-                <w:b w:val="false"/>
-                <w:bCs w:val="false"/>
-                <w:sz w:val="22"/>
-                <w:szCs w:val="22"/>
-              </w:rPr>
-              <w:t xml:space="preserve">Tìm kiếm, lọc, sắp xếp</w:t>
-            </w:r>
-          </w:p>
-        </w:tc>
-        <w:tc>
-          <w:tcPr>
-            <w:tcW w:type="pct" w:w="1000"/>
+            <w:tcW w:type="pct" w:w="1150"/>
+            <w:tcMar>
+              <w:top w:type="dxa" w:w="60"/>
+              <w:left w:type="dxa" w:w="100"/>
+              <w:bottom w:type="dxa" w:w="60"/>
+              <w:right w:type="dxa" w:w="100"/>
+            </w:tcMar>
+          </w:tcPr>
+          <w:p>
+            <w:r>
+              <w:rPr>
+                <w:b w:val="false"/>
+                <w:bCs w:val="false"/>
+                <w:sz w:val="22"/>
+                <w:szCs w:val="22"/>
+              </w:rPr>
+              <w:t xml:space="preserve">Quản lý tag</w:t>
+            </w:r>
+          </w:p>
+        </w:tc>
+        <w:tc>
+          <w:tcPr>
+            <w:tcW w:type="pct" w:w="950"/>
             <w:tcMar>
               <w:top w:type="dxa" w:w="60"/>
               <w:left w:type="dxa" w:w="100"/>
@@ -1306,23 +1306,23 @@
         </w:tc>
         <w:tc>
           <w:tcPr>
-            <w:tcW w:type="pct" w:w="550"/>
-            <w:tcMar>
-              <w:top w:type="dxa" w:w="60"/>
-              <w:left w:type="dxa" w:w="100"/>
-              <w:bottom w:type="dxa" w:w="60"/>
-              <w:right w:type="dxa" w:w="100"/>
-            </w:tcMar>
-          </w:tcPr>
-          <w:p>
-            <w:r>
-              <w:rPr>
-                <w:b w:val="false"/>
-                <w:bCs w:val="false"/>
-                <w:sz w:val="22"/>
-                <w:szCs w:val="22"/>
-              </w:rPr>
-              <w:t xml:space="preserve">Chính</w:t>
+            <w:tcW w:type="pct" w:w="650"/>
+            <w:tcMar>
+              <w:top w:type="dxa" w:w="60"/>
+              <w:left w:type="dxa" w:w="100"/>
+              <w:bottom w:type="dxa" w:w="60"/>
+              <w:right w:type="dxa" w:w="100"/>
+            </w:tcMar>
+          </w:tcPr>
+          <w:p>
+            <w:r>
+              <w:rPr>
+                <w:b w:val="false"/>
+                <w:bCs w:val="false"/>
+                <w:sz w:val="22"/>
+                <w:szCs w:val="22"/>
+              </w:rPr>
+              <w:t xml:space="preserve">Đã làm</w:t>
             </w:r>
           </w:p>
         </w:tc>
@@ -1344,7 +1344,7 @@
                 <w:sz w:val="22"/>
                 <w:szCs w:val="22"/>
               </w:rPr>
-              <w:t xml:space="preserve">Tìm theo tên; lọc theo danh mục/trạng thái; sắp xếp theo ngày hoặc chi phí.</w:t>
+              <w:t xml:space="preserve">Tạo, sửa, xóa tag có màu; xem số gói theo tag, nền tảng và chi phí theo danh mục.</w:t>
             </w:r>
           </w:p>
         </w:tc>
@@ -1374,29 +1374,29 @@
         </w:tc>
         <w:tc>
           <w:tcPr>
-            <w:tcW w:type="pct" w:w="1200"/>
-            <w:tcMar>
-              <w:top w:type="dxa" w:w="60"/>
-              <w:left w:type="dxa" w:w="100"/>
-              <w:bottom w:type="dxa" w:w="60"/>
-              <w:right w:type="dxa" w:w="100"/>
-            </w:tcMar>
-          </w:tcPr>
-          <w:p>
-            <w:r>
-              <w:rPr>
-                <w:b w:val="false"/>
-                <w:bCs w:val="false"/>
-                <w:sz w:val="22"/>
-                <w:szCs w:val="22"/>
-              </w:rPr>
-              <w:t xml:space="preserve">Xem thống kê chi phí</w:t>
-            </w:r>
-          </w:p>
-        </w:tc>
-        <w:tc>
-          <w:tcPr>
-            <w:tcW w:type="pct" w:w="1000"/>
+            <w:tcW w:type="pct" w:w="1150"/>
+            <w:tcMar>
+              <w:top w:type="dxa" w:w="60"/>
+              <w:left w:type="dxa" w:w="100"/>
+              <w:bottom w:type="dxa" w:w="60"/>
+              <w:right w:type="dxa" w:w="100"/>
+            </w:tcMar>
+          </w:tcPr>
+          <w:p>
+            <w:r>
+              <w:rPr>
+                <w:b w:val="false"/>
+                <w:bCs w:val="false"/>
+                <w:sz w:val="22"/>
+                <w:szCs w:val="22"/>
+              </w:rPr>
+              <w:t xml:space="preserve">Đặt nhắc hạn cho gói</w:t>
+            </w:r>
+          </w:p>
+        </w:tc>
+        <w:tc>
+          <w:tcPr>
+            <w:tcW w:type="pct" w:w="950"/>
             <w:tcMar>
               <w:top w:type="dxa" w:w="60"/>
               <w:left w:type="dxa" w:w="100"/>
@@ -1418,23 +1418,23 @@
         </w:tc>
         <w:tc>
           <w:tcPr>
-            <w:tcW w:type="pct" w:w="550"/>
-            <w:tcMar>
-              <w:top w:type="dxa" w:w="60"/>
-              <w:left w:type="dxa" w:w="100"/>
-              <w:bottom w:type="dxa" w:w="60"/>
-              <w:right w:type="dxa" w:w="100"/>
-            </w:tcMar>
-          </w:tcPr>
-          <w:p>
-            <w:r>
-              <w:rPr>
-                <w:b w:val="false"/>
-                <w:bCs w:val="false"/>
-                <w:sz w:val="22"/>
-                <w:szCs w:val="22"/>
-              </w:rPr>
-              <w:t xml:space="preserve">Chính</w:t>
+            <w:tcW w:type="pct" w:w="650"/>
+            <w:tcMar>
+              <w:top w:type="dxa" w:w="60"/>
+              <w:left w:type="dxa" w:w="100"/>
+              <w:bottom w:type="dxa" w:w="60"/>
+              <w:right w:type="dxa" w:w="100"/>
+            </w:tcMar>
+          </w:tcPr>
+          <w:p>
+            <w:r>
+              <w:rPr>
+                <w:b w:val="false"/>
+                <w:bCs w:val="false"/>
+                <w:sz w:val="22"/>
+                <w:szCs w:val="22"/>
+              </w:rPr>
+              <w:t xml:space="preserve">Đã làm</w:t>
             </w:r>
           </w:p>
         </w:tc>
@@ -1456,7 +1456,7 @@
                 <w:sz w:val="22"/>
                 <w:szCs w:val="22"/>
               </w:rPr>
-              <w:t xml:space="preserve">Tổng chi phí theo tháng, phân bổ theo danh mục, các gói chi phí cao.</w:t>
+              <w:t xml:space="preserve">Chọn nhắc đúng ngày hoặc trước 1, 3, 7, 30 ngày; bật/tắt nhắc hạn trong Cài đặt.</w:t>
             </w:r>
           </w:p>
         </w:tc>
@@ -1486,67 +1486,67 @@
         </w:tc>
         <w:tc>
           <w:tcPr>
-            <w:tcW w:type="pct" w:w="1200"/>
-            <w:tcMar>
-              <w:top w:type="dxa" w:w="60"/>
-              <w:left w:type="dxa" w:w="100"/>
-              <w:bottom w:type="dxa" w:w="60"/>
-              <w:right w:type="dxa" w:w="100"/>
-            </w:tcMar>
-          </w:tcPr>
-          <w:p>
-            <w:r>
-              <w:rPr>
-                <w:b w:val="false"/>
-                <w:bCs w:val="false"/>
-                <w:sz w:val="22"/>
-                <w:szCs w:val="22"/>
-              </w:rPr>
-              <w:t xml:space="preserve">Xem khoản sắp đến hạn</w:t>
-            </w:r>
-          </w:p>
-        </w:tc>
-        <w:tc>
-          <w:tcPr>
-            <w:tcW w:type="pct" w:w="1000"/>
-            <w:tcMar>
-              <w:top w:type="dxa" w:w="60"/>
-              <w:left w:type="dxa" w:w="100"/>
-              <w:bottom w:type="dxa" w:w="60"/>
-              <w:right w:type="dxa" w:w="100"/>
-            </w:tcMar>
-          </w:tcPr>
-          <w:p>
-            <w:r>
-              <w:rPr>
-                <w:b w:val="false"/>
-                <w:bCs w:val="false"/>
-                <w:sz w:val="22"/>
-                <w:szCs w:val="22"/>
-              </w:rPr>
-              <w:t xml:space="preserve">Người dùng</w:t>
-            </w:r>
-          </w:p>
-        </w:tc>
-        <w:tc>
-          <w:tcPr>
-            <w:tcW w:type="pct" w:w="550"/>
-            <w:tcMar>
-              <w:top w:type="dxa" w:w="60"/>
-              <w:left w:type="dxa" w:w="100"/>
-              <w:bottom w:type="dxa" w:w="60"/>
-              <w:right w:type="dxa" w:w="100"/>
-            </w:tcMar>
-          </w:tcPr>
-          <w:p>
-            <w:r>
-              <w:rPr>
-                <w:b w:val="false"/>
-                <w:bCs w:val="false"/>
-                <w:sz w:val="22"/>
-                <w:szCs w:val="22"/>
-              </w:rPr>
-              <w:t xml:space="preserve">Chính</w:t>
+            <w:tcW w:type="pct" w:w="1150"/>
+            <w:tcMar>
+              <w:top w:type="dxa" w:w="60"/>
+              <w:left w:type="dxa" w:w="100"/>
+              <w:bottom w:type="dxa" w:w="60"/>
+              <w:right w:type="dxa" w:w="100"/>
+            </w:tcMar>
+          </w:tcPr>
+          <w:p>
+            <w:r>
+              <w:rPr>
+                <w:b w:val="false"/>
+                <w:bCs w:val="false"/>
+                <w:sz w:val="22"/>
+                <w:szCs w:val="22"/>
+              </w:rPr>
+              <w:t xml:space="preserve">Thêm lịch thanh toán vào Lịch</w:t>
+            </w:r>
+          </w:p>
+        </w:tc>
+        <w:tc>
+          <w:tcPr>
+            <w:tcW w:type="pct" w:w="950"/>
+            <w:tcMar>
+              <w:top w:type="dxa" w:w="60"/>
+              <w:left w:type="dxa" w:w="100"/>
+              <w:bottom w:type="dxa" w:w="60"/>
+              <w:right w:type="dxa" w:w="100"/>
+            </w:tcMar>
+          </w:tcPr>
+          <w:p>
+            <w:r>
+              <w:rPr>
+                <w:b w:val="false"/>
+                <w:bCs w:val="false"/>
+                <w:sz w:val="22"/>
+                <w:szCs w:val="22"/>
+              </w:rPr>
+              <w:t xml:space="preserve">Người dùng, Ứng dụng Lịch</w:t>
+            </w:r>
+          </w:p>
+        </w:tc>
+        <w:tc>
+          <w:tcPr>
+            <w:tcW w:type="pct" w:w="650"/>
+            <w:tcMar>
+              <w:top w:type="dxa" w:w="60"/>
+              <w:left w:type="dxa" w:w="100"/>
+              <w:bottom w:type="dxa" w:w="60"/>
+              <w:right w:type="dxa" w:w="100"/>
+            </w:tcMar>
+          </w:tcPr>
+          <w:p>
+            <w:r>
+              <w:rPr>
+                <w:b w:val="false"/>
+                <w:bCs w:val="false"/>
+                <w:sz w:val="22"/>
+                <w:szCs w:val="22"/>
+              </w:rPr>
+              <w:t xml:space="preserve">Đã làm</w:t>
             </w:r>
           </w:p>
         </w:tc>
@@ -1568,7 +1568,7 @@
                 <w:sz w:val="22"/>
                 <w:szCs w:val="22"/>
               </w:rPr>
-              <w:t xml:space="preserve">Danh sách các gói sắp tới ngày thanh toán.</w:t>
+              <w:t xml:space="preserve">Mở ứng dụng Lịch với sự kiện lặp lại theo chu kỳ thanh toán.</w:t>
             </w:r>
           </w:p>
         </w:tc>
@@ -1598,29 +1598,29 @@
         </w:tc>
         <w:tc>
           <w:tcPr>
-            <w:tcW w:type="pct" w:w="1200"/>
-            <w:tcMar>
-              <w:top w:type="dxa" w:w="60"/>
-              <w:left w:type="dxa" w:w="100"/>
-              <w:bottom w:type="dxa" w:w="60"/>
-              <w:right w:type="dxa" w:w="100"/>
-            </w:tcMar>
-          </w:tcPr>
-          <w:p>
-            <w:r>
-              <w:rPr>
-                <w:b w:val="false"/>
-                <w:bCs w:val="false"/>
-                <w:sz w:val="22"/>
-                <w:szCs w:val="22"/>
-              </w:rPr>
-              <w:t xml:space="preserve">Cài đặt thời gian nhắc</w:t>
-            </w:r>
-          </w:p>
-        </w:tc>
-        <w:tc>
-          <w:tcPr>
-            <w:tcW w:type="pct" w:w="1000"/>
+            <w:tcW w:type="pct" w:w="1150"/>
+            <w:tcMar>
+              <w:top w:type="dxa" w:w="60"/>
+              <w:left w:type="dxa" w:w="100"/>
+              <w:bottom w:type="dxa" w:w="60"/>
+              <w:right w:type="dxa" w:w="100"/>
+            </w:tcMar>
+          </w:tcPr>
+          <w:p>
+            <w:r>
+              <w:rPr>
+                <w:b w:val="false"/>
+                <w:bCs w:val="false"/>
+                <w:sz w:val="22"/>
+                <w:szCs w:val="22"/>
+              </w:rPr>
+              <w:t xml:space="preserve">Xuất CSV / chia sẻ báo cáo</w:t>
+            </w:r>
+          </w:p>
+        </w:tc>
+        <w:tc>
+          <w:tcPr>
+            <w:tcW w:type="pct" w:w="950"/>
             <w:tcMar>
               <w:top w:type="dxa" w:w="60"/>
               <w:left w:type="dxa" w:w="100"/>
@@ -1642,23 +1642,23 @@
         </w:tc>
         <w:tc>
           <w:tcPr>
-            <w:tcW w:type="pct" w:w="550"/>
-            <w:tcMar>
-              <w:top w:type="dxa" w:w="60"/>
-              <w:left w:type="dxa" w:w="100"/>
-              <w:bottom w:type="dxa" w:w="60"/>
-              <w:right w:type="dxa" w:w="100"/>
-            </w:tcMar>
-          </w:tcPr>
-          <w:p>
-            <w:r>
-              <w:rPr>
-                <w:b w:val="false"/>
-                <w:bCs w:val="false"/>
-                <w:sz w:val="22"/>
-                <w:szCs w:val="22"/>
-              </w:rPr>
-              <w:t xml:space="preserve">Mở rộng</w:t>
+            <w:tcW w:type="pct" w:w="650"/>
+            <w:tcMar>
+              <w:top w:type="dxa" w:w="60"/>
+              <w:left w:type="dxa" w:w="100"/>
+              <w:bottom w:type="dxa" w:w="60"/>
+              <w:right w:type="dxa" w:w="100"/>
+            </w:tcMar>
+          </w:tcPr>
+          <w:p>
+            <w:r>
+              <w:rPr>
+                <w:b w:val="false"/>
+                <w:bCs w:val="false"/>
+                <w:sz w:val="22"/>
+                <w:szCs w:val="22"/>
+              </w:rPr>
+              <w:t xml:space="preserve">Đã làm</w:t>
             </w:r>
           </w:p>
         </w:tc>
@@ -1680,7 +1680,7 @@
                 <w:sz w:val="22"/>
                 <w:szCs w:val="22"/>
               </w:rPr>
-              <w:t xml:space="preserve">Chọn nhắc trước 1, 3 hoặc 7 ngày.</w:t>
+              <w:t xml:space="preserve">Lưu danh sách gói ra file CSV hoặc gửi tóm tắt chi phí qua ứng dụng khác.</w:t>
             </w:r>
           </w:p>
         </w:tc>
@@ -1710,29 +1710,29 @@
         </w:tc>
         <w:tc>
           <w:tcPr>
-            <w:tcW w:type="pct" w:w="1200"/>
-            <w:tcMar>
-              <w:top w:type="dxa" w:w="60"/>
-              <w:left w:type="dxa" w:w="100"/>
-              <w:bottom w:type="dxa" w:w="60"/>
-              <w:right w:type="dxa" w:w="100"/>
-            </w:tcMar>
-          </w:tcPr>
-          <w:p>
-            <w:r>
-              <w:rPr>
-                <w:b w:val="false"/>
-                <w:bCs w:val="false"/>
-                <w:sz w:val="22"/>
-                <w:szCs w:val="22"/>
-              </w:rPr>
-              <w:t xml:space="preserve">Đổi trạng thái gói</w:t>
-            </w:r>
-          </w:p>
-        </w:tc>
-        <w:tc>
-          <w:tcPr>
-            <w:tcW w:type="pct" w:w="1000"/>
+            <w:tcW w:type="pct" w:w="1150"/>
+            <w:tcMar>
+              <w:top w:type="dxa" w:w="60"/>
+              <w:left w:type="dxa" w:w="100"/>
+              <w:bottom w:type="dxa" w:w="60"/>
+              <w:right w:type="dxa" w:w="100"/>
+            </w:tcMar>
+          </w:tcPr>
+          <w:p>
+            <w:r>
+              <w:rPr>
+                <w:b w:val="false"/>
+                <w:bCs w:val="false"/>
+                <w:sz w:val="22"/>
+                <w:szCs w:val="22"/>
+              </w:rPr>
+              <w:t xml:space="preserve">Cài đặt ứng dụng</w:t>
+            </w:r>
+          </w:p>
+        </w:tc>
+        <w:tc>
+          <w:tcPr>
+            <w:tcW w:type="pct" w:w="950"/>
             <w:tcMar>
               <w:top w:type="dxa" w:w="60"/>
               <w:left w:type="dxa" w:w="100"/>
@@ -1754,23 +1754,23 @@
         </w:tc>
         <w:tc>
           <w:tcPr>
-            <w:tcW w:type="pct" w:w="550"/>
-            <w:tcMar>
-              <w:top w:type="dxa" w:w="60"/>
-              <w:left w:type="dxa" w:w="100"/>
-              <w:bottom w:type="dxa" w:w="60"/>
-              <w:right w:type="dxa" w:w="100"/>
-            </w:tcMar>
-          </w:tcPr>
-          <w:p>
-            <w:r>
-              <w:rPr>
-                <w:b w:val="false"/>
-                <w:bCs w:val="false"/>
-                <w:sz w:val="22"/>
-                <w:szCs w:val="22"/>
-              </w:rPr>
-              <w:t xml:space="preserve">Mở rộng</w:t>
+            <w:tcW w:type="pct" w:w="650"/>
+            <w:tcMar>
+              <w:top w:type="dxa" w:w="60"/>
+              <w:left w:type="dxa" w:w="100"/>
+              <w:bottom w:type="dxa" w:w="60"/>
+              <w:right w:type="dxa" w:w="100"/>
+            </w:tcMar>
+          </w:tcPr>
+          <w:p>
+            <w:r>
+              <w:rPr>
+                <w:b w:val="false"/>
+                <w:bCs w:val="false"/>
+                <w:sz w:val="22"/>
+                <w:szCs w:val="22"/>
+              </w:rPr>
+              <w:t xml:space="preserve">Đã làm</w:t>
             </w:r>
           </w:p>
         </w:tc>
@@ -1792,7 +1792,7 @@
                 <w:sz w:val="22"/>
                 <w:szCs w:val="22"/>
               </w:rPr>
-              <w:t xml:space="preserve">Đánh dấu gói đang hoạt động, tạm ngưng hoặc đã hủy.</w:t>
+              <w:t xml:space="preserve">Tiền tệ mặc định, gửi thông báo thử, thêm 5 gói mẫu, xóa toàn bộ dữ liệu.</w:t>
             </w:r>
           </w:p>
         </w:tc>
@@ -1822,67 +1822,67 @@
         </w:tc>
         <w:tc>
           <w:tcPr>
-            <w:tcW w:type="pct" w:w="1200"/>
-            <w:tcMar>
-              <w:top w:type="dxa" w:w="60"/>
-              <w:left w:type="dxa" w:w="100"/>
-              <w:bottom w:type="dxa" w:w="60"/>
-              <w:right w:type="dxa" w:w="100"/>
-            </w:tcMar>
-          </w:tcPr>
-          <w:p>
-            <w:r>
-              <w:rPr>
-                <w:b w:val="false"/>
-                <w:bCs w:val="false"/>
-                <w:sz w:val="22"/>
-                <w:szCs w:val="22"/>
-              </w:rPr>
-              <w:t xml:space="preserve">Xuất CSV / chia sẻ báo cáo</w:t>
-            </w:r>
-          </w:p>
-        </w:tc>
-        <w:tc>
-          <w:tcPr>
-            <w:tcW w:type="pct" w:w="1000"/>
-            <w:tcMar>
-              <w:top w:type="dxa" w:w="60"/>
-              <w:left w:type="dxa" w:w="100"/>
-              <w:bottom w:type="dxa" w:w="60"/>
-              <w:right w:type="dxa" w:w="100"/>
-            </w:tcMar>
-          </w:tcPr>
-          <w:p>
-            <w:r>
-              <w:rPr>
-                <w:b w:val="false"/>
-                <w:bCs w:val="false"/>
-                <w:sz w:val="22"/>
-                <w:szCs w:val="22"/>
-              </w:rPr>
-              <w:t xml:space="preserve">Người dùng</w:t>
-            </w:r>
-          </w:p>
-        </w:tc>
-        <w:tc>
-          <w:tcPr>
-            <w:tcW w:type="pct" w:w="550"/>
-            <w:tcMar>
-              <w:top w:type="dxa" w:w="60"/>
-              <w:left w:type="dxa" w:w="100"/>
-              <w:bottom w:type="dxa" w:w="60"/>
-              <w:right w:type="dxa" w:w="100"/>
-            </w:tcMar>
-          </w:tcPr>
-          <w:p>
-            <w:r>
-              <w:rPr>
-                <w:b w:val="false"/>
-                <w:bCs w:val="false"/>
-                <w:sz w:val="22"/>
-                <w:szCs w:val="22"/>
-              </w:rPr>
-              <w:t xml:space="preserve">Mở rộng</w:t>
+            <w:tcW w:type="pct" w:w="1150"/>
+            <w:tcMar>
+              <w:top w:type="dxa" w:w="60"/>
+              <w:left w:type="dxa" w:w="100"/>
+              <w:bottom w:type="dxa" w:w="60"/>
+              <w:right w:type="dxa" w:w="100"/>
+            </w:tcMar>
+          </w:tcPr>
+          <w:p>
+            <w:r>
+              <w:rPr>
+                <w:b w:val="false"/>
+                <w:bCs w:val="false"/>
+                <w:sz w:val="22"/>
+                <w:szCs w:val="22"/>
+              </w:rPr>
+              <w:t xml:space="preserve">Kiểm tra dữ liệu hợp lệ</w:t>
+            </w:r>
+          </w:p>
+        </w:tc>
+        <w:tc>
+          <w:tcPr>
+            <w:tcW w:type="pct" w:w="950"/>
+            <w:tcMar>
+              <w:top w:type="dxa" w:w="60"/>
+              <w:left w:type="dxa" w:w="100"/>
+              <w:bottom w:type="dxa" w:w="60"/>
+              <w:right w:type="dxa" w:w="100"/>
+            </w:tcMar>
+          </w:tcPr>
+          <w:p>
+            <w:r>
+              <w:rPr>
+                <w:b w:val="false"/>
+                <w:bCs w:val="false"/>
+                <w:sz w:val="22"/>
+                <w:szCs w:val="22"/>
+              </w:rPr>
+              <w:t xml:space="preserve">(được gọi bởi UC02, UC03)</w:t>
+            </w:r>
+          </w:p>
+        </w:tc>
+        <w:tc>
+          <w:tcPr>
+            <w:tcW w:type="pct" w:w="650"/>
+            <w:tcMar>
+              <w:top w:type="dxa" w:w="60"/>
+              <w:left w:type="dxa" w:w="100"/>
+              <w:bottom w:type="dxa" w:w="60"/>
+              <w:right w:type="dxa" w:w="100"/>
+            </w:tcMar>
+          </w:tcPr>
+          <w:p>
+            <w:r>
+              <w:rPr>
+                <w:b w:val="false"/>
+                <w:bCs w:val="false"/>
+                <w:sz w:val="22"/>
+                <w:szCs w:val="22"/>
+              </w:rPr>
+              <w:t xml:space="preserve">Đã làm</w:t>
             </w:r>
           </w:p>
         </w:tc>
@@ -1904,7 +1904,7 @@
                 <w:sz w:val="22"/>
                 <w:szCs w:val="22"/>
               </w:rPr>
-              <w:t xml:space="preserve">Xuất danh sách gói ra file CSV hoặc chia sẻ báo cáo chi phí.</w:t>
+              <w:t xml:space="preserve">Tên bắt buộc, tối đa 60 ký tự; số tiền hợp lệ, không âm; liên kết phải là http/https.</w:t>
             </w:r>
           </w:p>
         </w:tc>
@@ -1934,67 +1934,67 @@
         </w:tc>
         <w:tc>
           <w:tcPr>
-            <w:tcW w:type="pct" w:w="1200"/>
-            <w:tcMar>
-              <w:top w:type="dxa" w:w="60"/>
-              <w:left w:type="dxa" w:w="100"/>
-              <w:bottom w:type="dxa" w:w="60"/>
-              <w:right w:type="dxa" w:w="100"/>
-            </w:tcMar>
-          </w:tcPr>
-          <w:p>
-            <w:r>
-              <w:rPr>
-                <w:b w:val="false"/>
-                <w:bCs w:val="false"/>
-                <w:sz w:val="22"/>
-                <w:szCs w:val="22"/>
-              </w:rPr>
-              <w:t xml:space="preserve">Kiểm tra dữ liệu hợp lệ</w:t>
-            </w:r>
-          </w:p>
-        </w:tc>
-        <w:tc>
-          <w:tcPr>
-            <w:tcW w:type="pct" w:w="1000"/>
-            <w:tcMar>
-              <w:top w:type="dxa" w:w="60"/>
-              <w:left w:type="dxa" w:w="100"/>
-              <w:bottom w:type="dxa" w:w="60"/>
-              <w:right w:type="dxa" w:w="100"/>
-            </w:tcMar>
-          </w:tcPr>
-          <w:p>
-            <w:r>
-              <w:rPr>
-                <w:b w:val="false"/>
-                <w:bCs w:val="false"/>
-                <w:sz w:val="22"/>
-                <w:szCs w:val="22"/>
-              </w:rPr>
-              <w:t xml:space="preserve">(được gọi bởi UC03, UC05)</w:t>
-            </w:r>
-          </w:p>
-        </w:tc>
-        <w:tc>
-          <w:tcPr>
-            <w:tcW w:type="pct" w:w="550"/>
-            <w:tcMar>
-              <w:top w:type="dxa" w:w="60"/>
-              <w:left w:type="dxa" w:w="100"/>
-              <w:bottom w:type="dxa" w:w="60"/>
-              <w:right w:type="dxa" w:w="100"/>
-            </w:tcMar>
-          </w:tcPr>
-          <w:p>
-            <w:r>
-              <w:rPr>
-                <w:b w:val="false"/>
-                <w:bCs w:val="false"/>
-                <w:sz w:val="22"/>
-                <w:szCs w:val="22"/>
-              </w:rPr>
-              <w:t xml:space="preserve">Chính</w:t>
+            <w:tcW w:type="pct" w:w="1150"/>
+            <w:tcMar>
+              <w:top w:type="dxa" w:w="60"/>
+              <w:left w:type="dxa" w:w="100"/>
+              <w:bottom w:type="dxa" w:w="60"/>
+              <w:right w:type="dxa" w:w="100"/>
+            </w:tcMar>
+          </w:tcPr>
+          <w:p>
+            <w:r>
+              <w:rPr>
+                <w:b w:val="false"/>
+                <w:bCs w:val="false"/>
+                <w:sz w:val="22"/>
+                <w:szCs w:val="22"/>
+              </w:rPr>
+              <w:t xml:space="preserve">Đổi trạng thái gói</w:t>
+            </w:r>
+          </w:p>
+        </w:tc>
+        <w:tc>
+          <w:tcPr>
+            <w:tcW w:type="pct" w:w="950"/>
+            <w:tcMar>
+              <w:top w:type="dxa" w:w="60"/>
+              <w:left w:type="dxa" w:w="100"/>
+              <w:bottom w:type="dxa" w:w="60"/>
+              <w:right w:type="dxa" w:w="100"/>
+            </w:tcMar>
+          </w:tcPr>
+          <w:p>
+            <w:r>
+              <w:rPr>
+                <w:b w:val="false"/>
+                <w:bCs w:val="false"/>
+                <w:sz w:val="22"/>
+                <w:szCs w:val="22"/>
+              </w:rPr>
+              <w:t xml:space="preserve">Người dùng (mở rộng UC03)</w:t>
+            </w:r>
+          </w:p>
+        </w:tc>
+        <w:tc>
+          <w:tcPr>
+            <w:tcW w:type="pct" w:w="650"/>
+            <w:tcMar>
+              <w:top w:type="dxa" w:w="60"/>
+              <w:left w:type="dxa" w:w="100"/>
+              <w:bottom w:type="dxa" w:w="60"/>
+              <w:right w:type="dxa" w:w="100"/>
+            </w:tcMar>
+          </w:tcPr>
+          <w:p>
+            <w:r>
+              <w:rPr>
+                <w:b w:val="false"/>
+                <w:bCs w:val="false"/>
+                <w:sz w:val="22"/>
+                <w:szCs w:val="22"/>
+              </w:rPr>
+              <w:t xml:space="preserve">Đã làm</w:t>
             </w:r>
           </w:p>
         </w:tc>
@@ -2016,7 +2016,7 @@
                 <w:sz w:val="22"/>
                 <w:szCs w:val="22"/>
               </w:rPr>
-              <w:t xml:space="preserve">Tên không rỗng, số tiền không âm, ngày hợp lệ, chu kỳ bắt buộc.</w:t>
+              <w:t xml:space="preserve">Đang hoạt động, tạm dừng hoặc đã hủy; gói không hoạt động không tính vào chi phí.</w:t>
             </w:r>
           </w:p>
         </w:tc>
@@ -2046,67 +2046,67 @@
         </w:tc>
         <w:tc>
           <w:tcPr>
-            <w:tcW w:type="pct" w:w="1200"/>
-            <w:tcMar>
-              <w:top w:type="dxa" w:w="60"/>
-              <w:left w:type="dxa" w:w="100"/>
-              <w:bottom w:type="dxa" w:w="60"/>
-              <w:right w:type="dxa" w:w="100"/>
-            </w:tcMar>
-          </w:tcPr>
-          <w:p>
-            <w:r>
-              <w:rPr>
-                <w:b w:val="false"/>
-                <w:bCs w:val="false"/>
-                <w:sz w:val="22"/>
-                <w:szCs w:val="22"/>
-              </w:rPr>
-              <w:t xml:space="preserve">Xem biểu đồ chi phí</w:t>
-            </w:r>
-          </w:p>
-        </w:tc>
-        <w:tc>
-          <w:tcPr>
-            <w:tcW w:type="pct" w:w="1000"/>
-            <w:tcMar>
-              <w:top w:type="dxa" w:w="60"/>
-              <w:left w:type="dxa" w:w="100"/>
-              <w:bottom w:type="dxa" w:w="60"/>
-              <w:right w:type="dxa" w:w="100"/>
-            </w:tcMar>
-          </w:tcPr>
-          <w:p>
-            <w:r>
-              <w:rPr>
-                <w:b w:val="false"/>
-                <w:bCs w:val="false"/>
-                <w:sz w:val="22"/>
-                <w:szCs w:val="22"/>
-              </w:rPr>
-              <w:t xml:space="preserve">Người dùng</w:t>
-            </w:r>
-          </w:p>
-        </w:tc>
-        <w:tc>
-          <w:tcPr>
-            <w:tcW w:type="pct" w:w="550"/>
-            <w:tcMar>
-              <w:top w:type="dxa" w:w="60"/>
-              <w:left w:type="dxa" w:w="100"/>
-              <w:bottom w:type="dxa" w:w="60"/>
-              <w:right w:type="dxa" w:w="100"/>
-            </w:tcMar>
-          </w:tcPr>
-          <w:p>
-            <w:r>
-              <w:rPr>
-                <w:b w:val="false"/>
-                <w:bCs w:val="false"/>
-                <w:sz w:val="22"/>
-                <w:szCs w:val="22"/>
-              </w:rPr>
-              <w:t xml:space="preserve">Mở rộng</w:t>
+            <w:tcW w:type="pct" w:w="1150"/>
+            <w:tcMar>
+              <w:top w:type="dxa" w:w="60"/>
+              <w:left w:type="dxa" w:w="100"/>
+              <w:bottom w:type="dxa" w:w="60"/>
+              <w:right w:type="dxa" w:w="100"/>
+            </w:tcMar>
+          </w:tcPr>
+          <w:p>
+            <w:r>
+              <w:rPr>
+                <w:b w:val="false"/>
+                <w:bCs w:val="false"/>
+                <w:sz w:val="22"/>
+                <w:szCs w:val="22"/>
+              </w:rPr>
+              <w:t xml:space="preserve">Gửi thông báo nhắc hạn</w:t>
+            </w:r>
+          </w:p>
+        </w:tc>
+        <w:tc>
+          <w:tcPr>
+            <w:tcW w:type="pct" w:w="950"/>
+            <w:tcMar>
+              <w:top w:type="dxa" w:w="60"/>
+              <w:left w:type="dxa" w:w="100"/>
+              <w:bottom w:type="dxa" w:w="60"/>
+              <w:right w:type="dxa" w:w="100"/>
+            </w:tcMar>
+          </w:tcPr>
+          <w:p>
+            <w:r>
+              <w:rPr>
+                <w:b w:val="false"/>
+                <w:bCs w:val="false"/>
+                <w:sz w:val="22"/>
+                <w:szCs w:val="22"/>
+              </w:rPr>
+              <w:t xml:space="preserve">Hệ thống thông báo</w:t>
+            </w:r>
+          </w:p>
+        </w:tc>
+        <w:tc>
+          <w:tcPr>
+            <w:tcW w:type="pct" w:w="650"/>
+            <w:tcMar>
+              <w:top w:type="dxa" w:w="60"/>
+              <w:left w:type="dxa" w:w="100"/>
+              <w:bottom w:type="dxa" w:w="60"/>
+              <w:right w:type="dxa" w:w="100"/>
+            </w:tcMar>
+          </w:tcPr>
+          <w:p>
+            <w:r>
+              <w:rPr>
+                <w:b w:val="false"/>
+                <w:bCs w:val="false"/>
+                <w:sz w:val="22"/>
+                <w:szCs w:val="22"/>
+              </w:rPr>
+              <w:t xml:space="preserve">Đã làm</w:t>
             </w:r>
           </w:p>
         </w:tc>
@@ -2128,7 +2128,7 @@
                 <w:sz w:val="22"/>
                 <w:szCs w:val="22"/>
               </w:rPr>
-              <w:t xml:space="preserve">Biểu đồ chi phí theo tháng và theo danh mục (mở rộng UC08).</w:t>
+              <w:t xml:space="preserve">Kiểm tra hằng ngày và ngay sau khi lưu gói; mỗi kỳ thanh toán chỉ nhắc một lần.</w:t>
             </w:r>
           </w:p>
         </w:tc>
@@ -2158,67 +2158,67 @@
         </w:tc>
         <w:tc>
           <w:tcPr>
-            <w:tcW w:type="pct" w:w="1200"/>
-            <w:tcMar>
-              <w:top w:type="dxa" w:w="60"/>
-              <w:left w:type="dxa" w:w="100"/>
-              <w:bottom w:type="dxa" w:w="60"/>
-              <w:right w:type="dxa" w:w="100"/>
-            </w:tcMar>
-          </w:tcPr>
-          <w:p>
-            <w:r>
-              <w:rPr>
-                <w:b w:val="false"/>
-                <w:bCs w:val="false"/>
-                <w:sz w:val="22"/>
-                <w:szCs w:val="22"/>
-              </w:rPr>
-              <w:t xml:space="preserve">Gửi thông báo nhắc hạn</w:t>
-            </w:r>
-          </w:p>
-        </w:tc>
-        <w:tc>
-          <w:tcPr>
-            <w:tcW w:type="pct" w:w="1000"/>
-            <w:tcMar>
-              <w:top w:type="dxa" w:w="60"/>
-              <w:left w:type="dxa" w:w="100"/>
-              <w:bottom w:type="dxa" w:w="60"/>
-              <w:right w:type="dxa" w:w="100"/>
-            </w:tcMar>
-          </w:tcPr>
-          <w:p>
-            <w:r>
-              <w:rPr>
-                <w:b w:val="false"/>
-                <w:bCs w:val="false"/>
-                <w:sz w:val="22"/>
-                <w:szCs w:val="22"/>
-              </w:rPr>
-              <w:t xml:space="preserve">Hệ thống thông báo</w:t>
-            </w:r>
-          </w:p>
-        </w:tc>
-        <w:tc>
-          <w:tcPr>
-            <w:tcW w:type="pct" w:w="550"/>
-            <w:tcMar>
-              <w:top w:type="dxa" w:w="60"/>
-              <w:left w:type="dxa" w:w="100"/>
-              <w:bottom w:type="dxa" w:w="60"/>
-              <w:right w:type="dxa" w:w="100"/>
-            </w:tcMar>
-          </w:tcPr>
-          <w:p>
-            <w:r>
-              <w:rPr>
-                <w:b w:val="false"/>
-                <w:bCs w:val="false"/>
-                <w:sz w:val="22"/>
-                <w:szCs w:val="22"/>
-              </w:rPr>
-              <w:t xml:space="preserve">Chính</w:t>
+            <w:tcW w:type="pct" w:w="1150"/>
+            <w:tcMar>
+              <w:top w:type="dxa" w:w="60"/>
+              <w:left w:type="dxa" w:w="100"/>
+              <w:bottom w:type="dxa" w:w="60"/>
+              <w:right w:type="dxa" w:w="100"/>
+            </w:tcMar>
+          </w:tcPr>
+          <w:p>
+            <w:r>
+              <w:rPr>
+                <w:b w:val="false"/>
+                <w:bCs w:val="false"/>
+                <w:sz w:val="22"/>
+                <w:szCs w:val="22"/>
+              </w:rPr>
+              <w:t xml:space="preserve">Đăng nhập, đồng bộ đám mây</w:t>
+            </w:r>
+          </w:p>
+        </w:tc>
+        <w:tc>
+          <w:tcPr>
+            <w:tcW w:type="pct" w:w="950"/>
+            <w:tcMar>
+              <w:top w:type="dxa" w:w="60"/>
+              <w:left w:type="dxa" w:w="100"/>
+              <w:bottom w:type="dxa" w:w="60"/>
+              <w:right w:type="dxa" w:w="100"/>
+            </w:tcMar>
+          </w:tcPr>
+          <w:p>
+            <w:r>
+              <w:rPr>
+                <w:b w:val="false"/>
+                <w:bCs w:val="false"/>
+                <w:sz w:val="22"/>
+                <w:szCs w:val="22"/>
+              </w:rPr>
+              <w:t xml:space="preserve">Người dùng</w:t>
+            </w:r>
+          </w:p>
+        </w:tc>
+        <w:tc>
+          <w:tcPr>
+            <w:tcW w:type="pct" w:w="650"/>
+            <w:tcMar>
+              <w:top w:type="dxa" w:w="60"/>
+              <w:left w:type="dxa" w:w="100"/>
+              <w:bottom w:type="dxa" w:w="60"/>
+              <w:right w:type="dxa" w:w="100"/>
+            </w:tcMar>
+          </w:tcPr>
+          <w:p>
+            <w:r>
+              <w:rPr>
+                <w:b w:val="false"/>
+                <w:bCs w:val="false"/>
+                <w:sz w:val="22"/>
+                <w:szCs w:val="22"/>
+              </w:rPr>
+              <w:t xml:space="preserve">Hướng phát triển</w:t>
             </w:r>
           </w:p>
         </w:tc>
@@ -2240,7 +2240,7 @@
                 <w:sz w:val="22"/>
                 <w:szCs w:val="22"/>
               </w:rPr>
-              <w:t xml:space="preserve">Hiển thị nhắc hạn trong app; thông báo cục bộ nếu đủ thời gian.</w:t>
+              <w:t xml:space="preserve">Chưa triển khai; cần Firebase Authentication và Firestore.</w:t>
             </w:r>
           </w:p>
         </w:tc>
@@ -2261,7 +2261,7 @@
         <w:spacing w:before="240"/>
       </w:pPr>
       <w:r>
-        <w:t xml:space="preserve">UC03 – Thêm gói đăng ký</w:t>
+        <w:t xml:space="preserve">UC02 – Thêm gói đăng ký</w:t>
       </w:r>
     </w:p>
     <w:tbl>
@@ -2416,7 +2416,7 @@
                 <w:sz w:val="22"/>
                 <w:szCs w:val="22"/>
               </w:rPr>
-              <w:t xml:space="preserve">Ứng dụng đã mở; người dùng đã đăng nhập (nếu có chức năng tài khoản).</w:t>
+              <w:t xml:space="preserve">Ứng dụng đã mở, đã qua màn hình giới thiệu lần đầu.</w:t>
             </w:r>
           </w:p>
         </w:tc>
@@ -2463,29 +2463,29 @@
                 <w:sz w:val="22"/>
                 <w:szCs w:val="22"/>
               </w:rPr>
-              <w:t xml:space="preserve">1. Người dùng chọn “Thêm gói đăng ký”.</w:t>
-            </w:r>
-          </w:p>
-          <w:p>
-            <w:r>
-              <w:rPr>
-                <w:b w:val="false"/>
-                <w:bCs w:val="false"/>
-                <w:sz w:val="22"/>
-                <w:szCs w:val="22"/>
-              </w:rPr>
-              <w:t xml:space="preserve">2. Hệ thống hiển thị form nhập thông tin.</w:t>
-            </w:r>
-          </w:p>
-          <w:p>
-            <w:r>
-              <w:rPr>
-                <w:b w:val="false"/>
-                <w:bCs w:val="false"/>
-                <w:sz w:val="22"/>
-                <w:szCs w:val="22"/>
-              </w:rPr>
-              <w:t xml:space="preserve">3. Người dùng nhập tên dịch vụ, giá, đơn vị tiền, chu kỳ, ngày thanh toán tiếp theo, danh mục, ghi chú, URL quản lý.</w:t>
+              <w:t xml:space="preserve">1. Người dùng nhấn nút “Thêm gói đăng ký” trên màn hình Gói đăng ký.</w:t>
+            </w:r>
+          </w:p>
+          <w:p>
+            <w:r>
+              <w:rPr>
+                <w:b w:val="false"/>
+                <w:bCs w:val="false"/>
+                <w:sz w:val="22"/>
+                <w:szCs w:val="22"/>
+              </w:rPr>
+              <w:t xml:space="preserve">2. Hệ thống hiển thị form; tiền tệ mặc định lấy từ Cài đặt, ngày thanh toán gợi ý là một tháng sau.</w:t>
+            </w:r>
+          </w:p>
+          <w:p>
+            <w:r>
+              <w:rPr>
+                <w:b w:val="false"/>
+                <w:bCs w:val="false"/>
+                <w:sz w:val="22"/>
+                <w:szCs w:val="22"/>
+              </w:rPr>
+              <w:t xml:space="preserve">3. Người dùng nhập tên dịch vụ, số tiền, chọn tiền tệ, chu kỳ (tuần/tháng/quý/năm), ngày thanh toán tiếp theo, danh mục, trạng thái; có thể chọn nhắc trước, tag, nền tảng, nhập liên kết quản lý và ghi chú.</w:t>
             </w:r>
           </w:p>
           <w:p>
@@ -2507,29 +2507,29 @@
                 <w:sz w:val="22"/>
                 <w:szCs w:val="22"/>
               </w:rPr>
-              <w:t xml:space="preserve">5. Hệ thống kiểm tra dữ liệu hợp lệ (UC13).</w:t>
-            </w:r>
-          </w:p>
-          <w:p>
-            <w:r>
-              <w:rPr>
-                <w:b w:val="false"/>
-                <w:bCs w:val="false"/>
-                <w:sz w:val="22"/>
-                <w:szCs w:val="22"/>
-              </w:rPr>
-              <w:t xml:space="preserve">6. Hệ thống lưu bản ghi vào database và quay về danh sách.</w:t>
-            </w:r>
-          </w:p>
-          <w:p>
-            <w:r>
-              <w:rPr>
-                <w:b w:val="false"/>
-                <w:bCs w:val="false"/>
-                <w:sz w:val="22"/>
-                <w:szCs w:val="22"/>
-              </w:rPr>
-              <w:t xml:space="preserve">7. Danh sách và Dashboard được cập nhật.</w:t>
+              <w:t xml:space="preserve">5. Hệ thống kiểm tra dữ liệu hợp lệ (UC12).</w:t>
+            </w:r>
+          </w:p>
+          <w:p>
+            <w:r>
+              <w:rPr>
+                <w:b w:val="false"/>
+                <w:bCs w:val="false"/>
+                <w:sz w:val="22"/>
+                <w:szCs w:val="22"/>
+              </w:rPr>
+              <w:t xml:space="preserve">6. Hệ thống lưu bản ghi vào SQLite, kiểm tra nhắc hạn ngay (UC14), báo “Đã lưu gói đăng ký” và quay về danh sách.</w:t>
+            </w:r>
+          </w:p>
+          <w:p>
+            <w:r>
+              <w:rPr>
+                <w:b w:val="false"/>
+                <w:bCs w:val="false"/>
+                <w:sz w:val="22"/>
+                <w:szCs w:val="22"/>
+              </w:rPr>
+              <w:t xml:space="preserve">7. Danh sách và thẻ tổng quan được cập nhật.</w:t>
             </w:r>
           </w:p>
         </w:tc>
@@ -2576,18 +2576,29 @@
                 <w:sz w:val="22"/>
                 <w:szCs w:val="22"/>
               </w:rPr>
-              <w:t xml:space="preserve">5a. Dữ liệu không hợp lệ: hệ thống báo lỗi tại trường tương ứng, người dùng sửa và lưu lại.</w:t>
-            </w:r>
-          </w:p>
-          <w:p>
-            <w:r>
-              <w:rPr>
-                <w:b w:val="false"/>
-                <w:bCs w:val="false"/>
-                <w:sz w:val="22"/>
-                <w:szCs w:val="22"/>
-              </w:rPr>
-              <w:t xml:space="preserve">6a. Lỗi kết nối database: hệ thống thông báo lỗi và giữ nguyên dữ liệu trên form.</w:t>
+              <w:t xml:space="preserve">3a. Người dùng nhấn “Tag mới”: hộp thoại tạo tag mở ra; tag vừa tạo được chọn luôn.</w:t>
+            </w:r>
+          </w:p>
+          <w:p>
+            <w:r>
+              <w:rPr>
+                <w:b w:val="false"/>
+                <w:bCs w:val="false"/>
+                <w:sz w:val="22"/>
+                <w:szCs w:val="22"/>
+              </w:rPr>
+              <w:t xml:space="preserve">5a. Dữ liệu không hợp lệ: hệ thống báo lỗi dưới từng trường và hiện “Vui lòng sửa các trường bị lỗi”; người dùng sửa rồi lưu lại.</w:t>
+            </w:r>
+          </w:p>
+          <w:p>
+            <w:r>
+              <w:rPr>
+                <w:b w:val="false"/>
+                <w:bCs w:val="false"/>
+                <w:sz w:val="22"/>
+                <w:szCs w:val="22"/>
+              </w:rPr>
+              <w:t xml:space="preserve">6a. Lỗi ghi database: hệ thống báo “Không lưu được. Vui lòng thử lại.” và giữ nguyên dữ liệu trên form.</w:t>
             </w:r>
           </w:p>
         </w:tc>
@@ -2634,7 +2645,7 @@
                 <w:sz w:val="22"/>
                 <w:szCs w:val="22"/>
               </w:rPr>
-              <w:t xml:space="preserve">Gói mới được lưu và hiển thị trong danh sách.</w:t>
+              <w:t xml:space="preserve">Gói mới được lưu và hiển thị trong danh sách, báo cáo.</w:t>
             </w:r>
           </w:p>
         </w:tc>
@@ -2646,7 +2657,7 @@
         <w:spacing w:before="240"/>
       </w:pPr>
       <w:r>
-        <w:t xml:space="preserve">UC05 – Sửa gói đăng ký</w:t>
+        <w:t xml:space="preserve">UC03 – Xem và sửa gói đăng ký</w:t>
       </w:r>
     </w:p>
     <w:tbl>
@@ -2801,51 +2812,51 @@
                 <w:sz w:val="22"/>
                 <w:szCs w:val="22"/>
               </w:rPr>
-              <w:t xml:space="preserve">1. Người dùng mở chi tiết gói (UC04) và chọn “Sửa”.</w:t>
-            </w:r>
-          </w:p>
-          <w:p>
-            <w:r>
-              <w:rPr>
-                <w:b w:val="false"/>
-                <w:bCs w:val="false"/>
-                <w:sz w:val="22"/>
-                <w:szCs w:val="22"/>
-              </w:rPr>
-              <w:t xml:space="preserve">2. Hệ thống hiển thị form với dữ liệu hiện tại.</w:t>
-            </w:r>
-          </w:p>
-          <w:p>
-            <w:r>
-              <w:rPr>
-                <w:b w:val="false"/>
-                <w:bCs w:val="false"/>
-                <w:sz w:val="22"/>
-                <w:szCs w:val="22"/>
-              </w:rPr>
-              <w:t xml:space="preserve">3. Người dùng chỉnh sửa và nhấn “Lưu”.</w:t>
-            </w:r>
-          </w:p>
-          <w:p>
-            <w:r>
-              <w:rPr>
-                <w:b w:val="false"/>
-                <w:bCs w:val="false"/>
-                <w:sz w:val="22"/>
-                <w:szCs w:val="22"/>
-              </w:rPr>
-              <w:t xml:space="preserve">4. Hệ thống kiểm tra dữ liệu (UC13) và cập nhật database.</w:t>
-            </w:r>
-          </w:p>
-          <w:p>
-            <w:r>
-              <w:rPr>
-                <w:b w:val="false"/>
-                <w:bCs w:val="false"/>
-                <w:sz w:val="22"/>
-                <w:szCs w:val="22"/>
-              </w:rPr>
-              <w:t xml:space="preserve">5. Màn hình chi tiết, danh sách và Dashboard được cập nhật.</w:t>
+              <w:t xml:space="preserve">1. Người dùng chạm vào một gói trong danh sách.</w:t>
+            </w:r>
+          </w:p>
+          <w:p>
+            <w:r>
+              <w:rPr>
+                <w:b w:val="false"/>
+                <w:bCs w:val="false"/>
+                <w:sz w:val="22"/>
+                <w:szCs w:val="22"/>
+              </w:rPr>
+              <w:t xml:space="preserve">2. Hệ thống mở màn hình “Sửa gói đăng ký” với toàn bộ thông tin hiện tại.</w:t>
+            </w:r>
+          </w:p>
+          <w:p>
+            <w:r>
+              <w:rPr>
+                <w:b w:val="false"/>
+                <w:bCs w:val="false"/>
+                <w:sz w:val="22"/>
+                <w:szCs w:val="22"/>
+              </w:rPr>
+              <w:t xml:space="preserve">3. Người dùng chỉnh sửa (có thể đổi trạng thái – UC13) và nhấn “Lưu”.</w:t>
+            </w:r>
+          </w:p>
+          <w:p>
+            <w:r>
+              <w:rPr>
+                <w:b w:val="false"/>
+                <w:bCs w:val="false"/>
+                <w:sz w:val="22"/>
+                <w:szCs w:val="22"/>
+              </w:rPr>
+              <w:t xml:space="preserve">4. Hệ thống kiểm tra dữ liệu (UC12) và cập nhật database.</w:t>
+            </w:r>
+          </w:p>
+          <w:p>
+            <w:r>
+              <w:rPr>
+                <w:b w:val="false"/>
+                <w:bCs w:val="false"/>
+                <w:sz w:val="22"/>
+                <w:szCs w:val="22"/>
+              </w:rPr>
+              <w:t xml:space="preserve">5. Danh sách, tổng quan và báo cáo được cập nhật.</w:t>
             </w:r>
           </w:p>
         </w:tc>
@@ -2892,18 +2903,29 @@
                 <w:sz w:val="22"/>
                 <w:szCs w:val="22"/>
               </w:rPr>
-              <w:t xml:space="preserve">3a. Người dùng nhấn “Hủy”: không thay đổi dữ liệu.</w:t>
-            </w:r>
-          </w:p>
-          <w:p>
-            <w:r>
-              <w:rPr>
-                <w:b w:val="false"/>
-                <w:bCs w:val="false"/>
-                <w:sz w:val="22"/>
-                <w:szCs w:val="22"/>
-              </w:rPr>
-              <w:t xml:space="preserve">4a. Dữ liệu không hợp lệ: báo lỗi như UC03.</w:t>
+              <w:t xml:space="preserve">2a. Gói không còn tồn tại: hiển thị “Không tìm thấy gói đăng ký này”.</w:t>
+            </w:r>
+          </w:p>
+          <w:p>
+            <w:r>
+              <w:rPr>
+                <w:b w:val="false"/>
+                <w:bCs w:val="false"/>
+                <w:sz w:val="22"/>
+                <w:szCs w:val="22"/>
+              </w:rPr>
+              <w:t xml:space="preserve">3a. Người dùng nhấn nút quay lại: không thay đổi dữ liệu.</w:t>
+            </w:r>
+          </w:p>
+          <w:p>
+            <w:r>
+              <w:rPr>
+                <w:b w:val="false"/>
+                <w:bCs w:val="false"/>
+                <w:sz w:val="22"/>
+                <w:szCs w:val="22"/>
+              </w:rPr>
+              <w:t xml:space="preserve">4a. Dữ liệu không hợp lệ: báo lỗi như UC02.</w:t>
             </w:r>
           </w:p>
         </w:tc>
@@ -2962,7 +2984,7 @@
         <w:spacing w:before="240"/>
       </w:pPr>
       <w:r>
-        <w:t xml:space="preserve">UC06 – Xóa gói đăng ký</w:t>
+        <w:t xml:space="preserve">UC04 – Xóa gói đăng ký</w:t>
       </w:r>
     </w:p>
     <w:tbl>
@@ -3070,7 +3092,7 @@
                 <w:sz w:val="22"/>
                 <w:szCs w:val="22"/>
               </w:rPr>
-              <w:t xml:space="preserve">Đã có ít nhất một gói đăng ký.</w:t>
+              <w:t xml:space="preserve">Người dùng đang ở màn hình sửa một gói (UC03).</w:t>
             </w:r>
           </w:p>
         </w:tc>
@@ -3117,40 +3139,40 @@
                 <w:sz w:val="22"/>
                 <w:szCs w:val="22"/>
               </w:rPr>
-              <w:t xml:space="preserve">1. Người dùng chọn “Xóa” tại màn hình chi tiết hoặc vuốt trên danh sách.</w:t>
-            </w:r>
-          </w:p>
-          <w:p>
-            <w:r>
-              <w:rPr>
-                <w:b w:val="false"/>
-                <w:bCs w:val="false"/>
-                <w:sz w:val="22"/>
-                <w:szCs w:val="22"/>
-              </w:rPr>
-              <w:t xml:space="preserve">2. Hệ thống hiển thị hộp thoại xác nhận.</w:t>
-            </w:r>
-          </w:p>
-          <w:p>
-            <w:r>
-              <w:rPr>
-                <w:b w:val="false"/>
-                <w:bCs w:val="false"/>
-                <w:sz w:val="22"/>
-                <w:szCs w:val="22"/>
-              </w:rPr>
-              <w:t xml:space="preserve">3. Người dùng xác nhận xóa.</w:t>
-            </w:r>
-          </w:p>
-          <w:p>
-            <w:r>
-              <w:rPr>
-                <w:b w:val="false"/>
-                <w:bCs w:val="false"/>
-                <w:sz w:val="22"/>
-                <w:szCs w:val="22"/>
-              </w:rPr>
-              <w:t xml:space="preserve">4. Hệ thống xóa bản ghi khỏi database và cập nhật danh sách, Dashboard.</w:t>
+              <w:t xml:space="preserve">1. Người dùng nhấn biểu tượng thùng rác trên thanh tiêu đề.</w:t>
+            </w:r>
+          </w:p>
+          <w:p>
+            <w:r>
+              <w:rPr>
+                <w:b w:val="false"/>
+                <w:bCs w:val="false"/>
+                <w:sz w:val="22"/>
+                <w:szCs w:val="22"/>
+              </w:rPr>
+              <w:t xml:space="preserve">2. Hệ thống hiển thị hộp thoại “Xóa gói đăng ký?”.</w:t>
+            </w:r>
+          </w:p>
+          <w:p>
+            <w:r>
+              <w:rPr>
+                <w:b w:val="false"/>
+                <w:bCs w:val="false"/>
+                <w:sz w:val="22"/>
+                <w:szCs w:val="22"/>
+              </w:rPr>
+              <w:t xml:space="preserve">3. Người dùng nhấn “Xóa”.</w:t>
+            </w:r>
+          </w:p>
+          <w:p>
+            <w:r>
+              <w:rPr>
+                <w:b w:val="false"/>
+                <w:bCs w:val="false"/>
+                <w:sz w:val="22"/>
+                <w:szCs w:val="22"/>
+              </w:rPr>
+              <w:t xml:space="preserve">4. Hệ thống xóa bản ghi (kèm liên kết tag), báo “Đã xóa gói đăng ký” và quay về danh sách.</w:t>
             </w:r>
           </w:p>
         </w:tc>
@@ -3197,7 +3219,7 @@
                 <w:sz w:val="22"/>
                 <w:szCs w:val="22"/>
               </w:rPr>
-              <w:t xml:space="preserve">3a. Người dùng chọn “Hủy”: không xóa.</w:t>
+              <w:t xml:space="preserve">3a. Người dùng nhấn “Hủy”: không xóa.</w:t>
             </w:r>
           </w:p>
         </w:tc>
@@ -3244,7 +3266,7 @@
                 <w:sz w:val="22"/>
                 <w:szCs w:val="22"/>
               </w:rPr>
-              <w:t xml:space="preserve">Gói không còn trong danh sách và không được tính vào thống kê.</w:t>
+              <w:t xml:space="preserve">Gói không còn trong danh sách và không được tính vào báo cáo.</w:t>
             </w:r>
           </w:p>
         </w:tc>
@@ -3256,7 +3278,7 @@
         <w:spacing w:before="240"/>
       </w:pPr>
       <w:r>
-        <w:t xml:space="preserve">UC07 – Tìm kiếm, lọc, sắp xếp</w:t>
+        <w:t xml:space="preserve">UC05 – Tìm kiếm, lọc, sắp xếp</w:t>
       </w:r>
     </w:p>
     <w:tbl>
@@ -3364,40 +3386,40 @@
                 <w:sz w:val="22"/>
                 <w:szCs w:val="22"/>
               </w:rPr>
-              <w:t xml:space="preserve">1. Người dùng mở màn hình danh sách gói.</w:t>
-            </w:r>
-          </w:p>
-          <w:p>
-            <w:r>
-              <w:rPr>
-                <w:b w:val="false"/>
-                <w:bCs w:val="false"/>
-                <w:sz w:val="22"/>
-                <w:szCs w:val="22"/>
-              </w:rPr>
-              <w:t xml:space="preserve">2. Người dùng nhập từ khóa vào ô tìm kiếm và/hoặc chọn bộ lọc danh mục, trạng thái.</w:t>
-            </w:r>
-          </w:p>
-          <w:p>
-            <w:r>
-              <w:rPr>
-                <w:b w:val="false"/>
-                <w:bCs w:val="false"/>
-                <w:sz w:val="22"/>
-                <w:szCs w:val="22"/>
-              </w:rPr>
-              <w:t xml:space="preserve">3. Người dùng chọn tiêu chí sắp xếp (ngày thanh toán gần nhất hoặc chi phí).</w:t>
-            </w:r>
-          </w:p>
-          <w:p>
-            <w:r>
-              <w:rPr>
-                <w:b w:val="false"/>
-                <w:bCs w:val="false"/>
-                <w:sz w:val="22"/>
-                <w:szCs w:val="22"/>
-              </w:rPr>
-              <w:t xml:space="preserve">4. Hệ thống hiển thị danh sách kết quả phù hợp.</w:t>
+              <w:t xml:space="preserve">1. Người dùng mở màn hình Gói đăng ký.</w:t>
+            </w:r>
+          </w:p>
+          <w:p>
+            <w:r>
+              <w:rPr>
+                <w:b w:val="false"/>
+                <w:bCs w:val="false"/>
+                <w:sz w:val="22"/>
+                <w:szCs w:val="22"/>
+              </w:rPr>
+              <w:t xml:space="preserve">2. Người dùng nhập từ khóa (tên, tag, nền tảng hoặc danh mục) và/hoặc chọn bộ lọc trạng thái, danh mục.</w:t>
+            </w:r>
+          </w:p>
+          <w:p>
+            <w:r>
+              <w:rPr>
+                <w:b w:val="false"/>
+                <w:bCs w:val="false"/>
+                <w:sz w:val="22"/>
+                <w:szCs w:val="22"/>
+              </w:rPr>
+              <w:t xml:space="preserve">3. Người dùng chọn cách sắp xếp: ngày thanh toán gần nhất, chi phí tháng cao nhất, tên (A–Z).</w:t>
+            </w:r>
+          </w:p>
+          <w:p>
+            <w:r>
+              <w:rPr>
+                <w:b w:val="false"/>
+                <w:bCs w:val="false"/>
+                <w:sz w:val="22"/>
+                <w:szCs w:val="22"/>
+              </w:rPr>
+              <w:t xml:space="preserve">4. Hệ thống hiển thị ngay danh sách phù hợp.</w:t>
             </w:r>
           </w:p>
         </w:tc>
@@ -3444,7 +3466,7 @@
                 <w:sz w:val="22"/>
                 <w:szCs w:val="22"/>
               </w:rPr>
-              <w:t xml:space="preserve">4a. Không có kết quả: hiển thị trạng thái rỗng kèm gợi ý xóa bộ lọc.</w:t>
+              <w:t xml:space="preserve">4a. Không có kết quả: hiển thị “Không tìm thấy gói phù hợp” kèm nút “Xóa bộ lọc”.</w:t>
             </w:r>
           </w:p>
         </w:tc>
@@ -3456,7 +3478,7 @@
         <w:spacing w:before="240"/>
       </w:pPr>
       <w:r>
-        <w:t xml:space="preserve">UC08 – Xem thống kê chi phí</w:t>
+        <w:t xml:space="preserve">UC06 – Xem báo cáo chi phí</w:t>
       </w:r>
     </w:p>
     <w:tbl>
@@ -3564,40 +3586,29 @@
                 <w:sz w:val="22"/>
                 <w:szCs w:val="22"/>
               </w:rPr>
-              <w:t xml:space="preserve">1. Người dùng mở màn hình Thống kê.</w:t>
-            </w:r>
-          </w:p>
-          <w:p>
-            <w:r>
-              <w:rPr>
-                <w:b w:val="false"/>
-                <w:bCs w:val="false"/>
-                <w:sz w:val="22"/>
-                <w:szCs w:val="22"/>
-              </w:rPr>
-              <w:t xml:space="preserve">2. Hệ thống quy đổi chi phí từng gói về tháng (tuần × 52/12, năm ÷ 12).</w:t>
-            </w:r>
-          </w:p>
-          <w:p>
-            <w:r>
-              <w:rPr>
-                <w:b w:val="false"/>
-                <w:bCs w:val="false"/>
-                <w:sz w:val="22"/>
-                <w:szCs w:val="22"/>
-              </w:rPr>
-              <w:t xml:space="preserve">3. Hệ thống hiển thị tổng chi phí tháng, chi phí theo danh mục và danh sách gói chi phí cao.</w:t>
-            </w:r>
-          </w:p>
-          <w:p>
-            <w:r>
-              <w:rPr>
-                <w:b w:val="false"/>
-                <w:bCs w:val="false"/>
-                <w:sz w:val="22"/>
-                <w:szCs w:val="22"/>
-              </w:rPr>
-              <w:t xml:space="preserve">4. (Mở rộng – UC14) Người dùng xem biểu đồ chi phí theo tháng/danh mục.</w:t>
+              <w:t xml:space="preserve">1. Người dùng mở tab Báo cáo và có thể chọn tiền tệ báo cáo.</w:t>
+            </w:r>
+          </w:p>
+          <w:p>
+            <w:r>
+              <w:rPr>
+                <w:b w:val="false"/>
+                <w:bCs w:val="false"/>
+                <w:sz w:val="22"/>
+                <w:szCs w:val="22"/>
+              </w:rPr>
+              <w:t xml:space="preserve">2. Hệ thống quy đổi chi phí từng gói đang hoạt động về tháng (tuần × 52 ÷ 12, quý ÷ 3, năm ÷ 12).</w:t>
+            </w:r>
+          </w:p>
+          <w:p>
+            <w:r>
+              <w:rPr>
+                <w:b w:val="false"/>
+                <w:bCs w:val="false"/>
+                <w:sz w:val="22"/>
+                <w:szCs w:val="22"/>
+              </w:rPr>
+              <w:t xml:space="preserve">3. Hệ thống hiển thị chi phí mỗi tuần, tháng, quý, năm; biểu đồ tròn cơ cấu theo gói (gộp “Các gói khác” khi quá 6 gói); chi phí theo danh mục; 3 gói tốn kém nhất.</w:t>
             </w:r>
           </w:p>
         </w:tc>
@@ -3644,7 +3655,18 @@
                 <w:sz w:val="22"/>
                 <w:szCs w:val="22"/>
               </w:rPr>
-              <w:t xml:space="preserve">2a. Chưa có gói nào: hiển thị trạng thái rỗng.</w:t>
+              <w:t xml:space="preserve">2a. Chưa có gói đang hoạt động: hiển thị “Chưa có gói đang hoạt động để thống kê”.</w:t>
+            </w:r>
+          </w:p>
+          <w:p>
+            <w:r>
+              <w:rPr>
+                <w:b w:val="false"/>
+                <w:bCs w:val="false"/>
+                <w:sz w:val="22"/>
+                <w:szCs w:val="22"/>
+              </w:rPr>
+              <w:t xml:space="preserve">2b. Có gói dùng tiền tệ khác: không quy đổi tỷ giá, hiển thị ghi chú số gói không được cộng vào.</w:t>
             </w:r>
           </w:p>
         </w:tc>
@@ -3656,7 +3678,7 @@
         <w:spacing w:before="240"/>
       </w:pPr>
       <w:r>
-        <w:t xml:space="preserve">UC09 – Xem khoản sắp đến hạn</w:t>
+        <w:t xml:space="preserve">UC08 / UC14 – Nhắc hạn thanh toán</w:t>
       </w:r>
     </w:p>
     <w:tbl>
@@ -3717,7 +3739,7 @@
                 <w:sz w:val="22"/>
                 <w:szCs w:val="22"/>
               </w:rPr>
-              <w:t xml:space="preserve">Người dùng; Hệ thống thông báo (qua UC15)</w:t>
+              <w:t xml:space="preserve">Người dùng; Hệ thống thông báo</w:t>
             </w:r>
           </w:p>
         </w:tc>
@@ -3742,7 +3764,7 @@
                 <w:sz w:val="22"/>
                 <w:szCs w:val="22"/>
               </w:rPr>
-              <w:t xml:space="preserve">Luồng chính</w:t>
+              <w:t xml:space="preserve">Tiền điều kiện</w:t>
             </w:r>
           </w:p>
         </w:tc>
@@ -3764,29 +3786,7 @@
                 <w:sz w:val="22"/>
                 <w:szCs w:val="22"/>
               </w:rPr>
-              <w:t xml:space="preserve">1. Hệ thống so sánh ngày thanh toán tiếp theo của các gói với ngày hiện tại.</w:t>
-            </w:r>
-          </w:p>
-          <w:p>
-            <w:r>
-              <w:rPr>
-                <w:b w:val="false"/>
-                <w:bCs w:val="false"/>
-                <w:sz w:val="22"/>
-                <w:szCs w:val="22"/>
-              </w:rPr>
-              <w:t xml:space="preserve">2. Hệ thống hiển thị các gói đến hạn trong khoảng nhắc (mặc định 7 ngày) trên Dashboard.</w:t>
-            </w:r>
-          </w:p>
-          <w:p>
-            <w:r>
-              <w:rPr>
-                <w:b w:val="false"/>
-                <w:bCs w:val="false"/>
-                <w:sz w:val="22"/>
-                <w:szCs w:val="22"/>
-              </w:rPr>
-              <w:t xml:space="preserve">3. Hệ thống gửi thông báo nhắc hạn (UC15) nếu đã triển khai thông báo cục bộ.</w:t>
+              <w:t xml:space="preserve">Nhắc hạn đang bật trong Cài đặt; trên Android 13+ người dùng đã cấp quyền thông báo.</w:t>
             </w:r>
           </w:p>
         </w:tc>
@@ -3811,6 +3811,144 @@
                 <w:sz w:val="22"/>
                 <w:szCs w:val="22"/>
               </w:rPr>
+              <w:t xml:space="preserve">Luồng chính</w:t>
+            </w:r>
+          </w:p>
+        </w:tc>
+        <w:tc>
+          <w:tcPr>
+            <w:tcW w:type="pct" w:w="3700"/>
+            <w:tcMar>
+              <w:top w:type="dxa" w:w="60"/>
+              <w:left w:type="dxa" w:w="100"/>
+              <w:bottom w:type="dxa" w:w="60"/>
+              <w:right w:type="dxa" w:w="100"/>
+            </w:tcMar>
+          </w:tcPr>
+          <w:p>
+            <w:r>
+              <w:rPr>
+                <w:b w:val="false"/>
+                <w:bCs w:val="false"/>
+                <w:sz w:val="22"/>
+                <w:szCs w:val="22"/>
+              </w:rPr>
+              <w:t xml:space="preserve">1. Người dùng chọn “Nhắc trước” cho từng gói (mặc định 3 ngày) và lưu.</w:t>
+            </w:r>
+          </w:p>
+          <w:p>
+            <w:r>
+              <w:rPr>
+                <w:b w:val="false"/>
+                <w:bCs w:val="false"/>
+                <w:sz w:val="22"/>
+                <w:szCs w:val="22"/>
+              </w:rPr>
+              <w:t xml:space="preserve">2. Hệ thống thông báo (WorkManager) chạy kiểm tra hằng ngày và ngay sau mỗi lần lưu.</w:t>
+            </w:r>
+          </w:p>
+          <w:p>
+            <w:r>
+              <w:rPr>
+                <w:b w:val="false"/>
+                <w:bCs w:val="false"/>
+                <w:sz w:val="22"/>
+                <w:szCs w:val="22"/>
+              </w:rPr>
+              <w:t xml:space="preserve">3. Với mỗi gói đang hoạt động có số ngày còn lại nằm trong khoảng nhắc, hệ thống hiển thị thông báo “&lt;tên&gt; sắp đến hạn”.</w:t>
+            </w:r>
+          </w:p>
+          <w:p>
+            <w:r>
+              <w:rPr>
+                <w:b w:val="false"/>
+                <w:bCs w:val="false"/>
+                <w:sz w:val="22"/>
+                <w:szCs w:val="22"/>
+              </w:rPr>
+              <w:t xml:space="preserve">4. Người dùng chạm thông báo để mở ứng dụng.</w:t>
+            </w:r>
+          </w:p>
+        </w:tc>
+      </w:tr>
+      <w:tr>
+        <w:tc>
+          <w:tcPr>
+            <w:tcW w:type="pct" w:w="1300"/>
+            <w:shd w:fill="E6E1F7" w:color="auto" w:val="clear"/>
+            <w:tcMar>
+              <w:top w:type="dxa" w:w="60"/>
+              <w:left w:type="dxa" w:w="100"/>
+              <w:bottom w:type="dxa" w:w="60"/>
+              <w:right w:type="dxa" w:w="100"/>
+            </w:tcMar>
+          </w:tcPr>
+          <w:p>
+            <w:r>
+              <w:rPr>
+                <w:b/>
+                <w:bCs/>
+                <w:sz w:val="22"/>
+                <w:szCs w:val="22"/>
+              </w:rPr>
+              <w:t xml:space="preserve">Luồng thay thế</w:t>
+            </w:r>
+          </w:p>
+        </w:tc>
+        <w:tc>
+          <w:tcPr>
+            <w:tcW w:type="pct" w:w="3700"/>
+            <w:tcMar>
+              <w:top w:type="dxa" w:w="60"/>
+              <w:left w:type="dxa" w:w="100"/>
+              <w:bottom w:type="dxa" w:w="60"/>
+              <w:right w:type="dxa" w:w="100"/>
+            </w:tcMar>
+          </w:tcPr>
+          <w:p>
+            <w:r>
+              <w:rPr>
+                <w:b w:val="false"/>
+                <w:bCs w:val="false"/>
+                <w:sz w:val="22"/>
+                <w:szCs w:val="22"/>
+              </w:rPr>
+              <w:t xml:space="preserve">1a. Người dùng từ chối quyền thông báo: hiển thị hướng dẫn bật quyền trong Cài đặt Android.</w:t>
+            </w:r>
+          </w:p>
+          <w:p>
+            <w:r>
+              <w:rPr>
+                <w:b w:val="false"/>
+                <w:bCs w:val="false"/>
+                <w:sz w:val="22"/>
+                <w:szCs w:val="22"/>
+              </w:rPr>
+              <w:t xml:space="preserve">3a. Đã nhắc cho kỳ thanh toán này: không nhắc lại.</w:t>
+            </w:r>
+          </w:p>
+        </w:tc>
+      </w:tr>
+      <w:tr>
+        <w:tc>
+          <w:tcPr>
+            <w:tcW w:type="pct" w:w="1300"/>
+            <w:shd w:fill="E6E1F7" w:color="auto" w:val="clear"/>
+            <w:tcMar>
+              <w:top w:type="dxa" w:w="60"/>
+              <w:left w:type="dxa" w:w="100"/>
+              <w:bottom w:type="dxa" w:w="60"/>
+              <w:right w:type="dxa" w:w="100"/>
+            </w:tcMar>
+          </w:tcPr>
+          <w:p>
+            <w:r>
+              <w:rPr>
+                <w:b/>
+                <w:bCs/>
+                <w:sz w:val="22"/>
+                <w:szCs w:val="22"/>
+              </w:rPr>
               <w:t xml:space="preserve">Hậu điều kiện</w:t>
             </w:r>
           </w:p>
@@ -3833,7 +3971,7 @@
                 <w:sz w:val="22"/>
                 <w:szCs w:val="22"/>
               </w:rPr>
-              <w:t xml:space="preserve">Người dùng biết các khoản sắp phải thanh toán.</w:t>
+              <w:t xml:space="preserve">Người dùng biết khoản sắp phải thanh toán. Ngày đã qua tự chuyển sang kỳ kế tiếp khi mở ứng dụng.</w:t>
             </w:r>
           </w:p>
         </w:tc>

</xml_diff>